<commit_message>
docx: bordes de tabla más suaves y justificado solo en columnas anchas
Grilla partida en horizontales (C7CBCF) y verticales (E2E5E8), encabezado
más claro. Se justifica el texto solo cuando la columna supera el 22% de
ancho: en columnas angostas el justificado abría ríos.

Regenerado etapa3-acta-proyecto.docx con estos cambios.

Co-Authored-By: Claude Opus 5 <noreply@anthropic.com>
</commit_message>
<xml_diff>
--- a/materias/ASI/etapa3-acta-proyecto.docx
+++ b/materias/ASI/etapa3-acta-proyecto.docx
@@ -6,11 +6,7 @@
       <w:pPr>
         <w:pStyle w:val="Heading1"/>
         <w:keepNext/>
-        <w:pBdr>
-          <w:top w:val="single" w:color="9AA0A6" w:sz="8"/>
-          <w:bottom w:val="single" w:color="9AA0A6" w:sz="8"/>
-        </w:pBdr>
-        <w:spacing w:after="200" w:before="400"/>
+        <w:spacing w:after="260" w:before="560"/>
         <w:jc w:val="center"/>
       </w:pPr>
       <w:r>
@@ -19,9 +15,9 @@
           <w:b/>
           <w:bCs/>
           <w:color w:val="1A1A1A"/>
-          <w:spacing w:val="20"/>
-          <w:sz w:val="26"/>
-          <w:szCs w:val="26"/>
+          <w:spacing w:val="30"/>
+          <w:sz w:val="25"/>
+          <w:szCs w:val="25"/>
         </w:rPr>
         <w:t xml:space="preserve">ACTA DEL PROYECTO</w:t>
       </w:r>
@@ -45,20 +41,14 @@
     </w:p>
     <w:p>
       <w:pPr>
-        <w:pBdr>
-          <w:bottom w:val="single" w:color="9AA0A6" w:sz="6"/>
-        </w:pBdr>
-        <w:spacing w:after="240" w:before="120"/>
+        <w:spacing w:after="260" w:before="0"/>
       </w:pPr>
     </w:p>
     <w:p>
       <w:pPr>
         <w:pStyle w:val="Heading2"/>
         <w:keepNext/>
-        <w:pBdr>
-          <w:bottom w:val="single" w:color="9AA0A6" w:sz="4"/>
-        </w:pBdr>
-        <w:spacing w:after="120" w:before="320"/>
+        <w:spacing w:after="140" w:before="400"/>
       </w:pPr>
       <w:r>
         <w:rPr>
@@ -66,9 +56,9 @@
           <w:b/>
           <w:bCs/>
           <w:color w:val="1A1A1A"/>
-          <w:spacing w:val="14"/>
-          <w:sz w:val="22"/>
-          <w:szCs w:val="22"/>
+          <w:spacing w:val="18"/>
+          <w:sz w:val="21"/>
+          <w:szCs w:val="21"/>
         </w:rPr>
         <w:t xml:space="preserve">DE</w:t>
       </w:r>
@@ -120,10 +110,7 @@
       <w:pPr>
         <w:pStyle w:val="Heading2"/>
         <w:keepNext/>
-        <w:pBdr>
-          <w:bottom w:val="single" w:color="9AA0A6" w:sz="4"/>
-        </w:pBdr>
-        <w:spacing w:after="120" w:before="320"/>
+        <w:spacing w:after="140" w:before="400"/>
       </w:pPr>
       <w:r>
         <w:rPr>
@@ -131,9 +118,9 @@
           <w:b/>
           <w:bCs/>
           <w:color w:val="1A1A1A"/>
-          <w:spacing w:val="14"/>
-          <w:sz w:val="22"/>
-          <w:szCs w:val="22"/>
+          <w:spacing w:val="18"/>
+          <w:sz w:val="21"/>
+          <w:szCs w:val="21"/>
         </w:rPr>
         <w:t xml:space="preserve">PARA</w:t>
       </w:r>
@@ -332,10 +319,7 @@
       <w:pPr>
         <w:pStyle w:val="Heading2"/>
         <w:keepNext/>
-        <w:pBdr>
-          <w:bottom w:val="single" w:color="9AA0A6" w:sz="4"/>
-        </w:pBdr>
-        <w:spacing w:after="120" w:before="320"/>
+        <w:spacing w:after="140" w:before="400"/>
       </w:pPr>
       <w:r>
         <w:rPr>
@@ -343,9 +327,9 @@
           <w:b/>
           <w:bCs/>
           <w:color w:val="1A1A1A"/>
-          <w:spacing w:val="14"/>
-          <w:sz w:val="22"/>
-          <w:szCs w:val="22"/>
+          <w:spacing w:val="18"/>
+          <w:sz w:val="21"/>
+          <w:szCs w:val="21"/>
         </w:rPr>
         <w:t xml:space="preserve">DESIGNACIÓN</w:t>
       </w:r>
@@ -369,12 +353,12 @@
       <w:tblPr>
         <w:tblW w:type="dxa" w:w="9638"/>
         <w:tblBorders>
-          <w:top w:val="single" w:color="BFC4C9" w:sz="4"/>
-          <w:left w:val="single" w:color="BFC4C9" w:sz="4"/>
-          <w:bottom w:val="single" w:color="BFC4C9" w:sz="4"/>
-          <w:right w:val="single" w:color="BFC4C9" w:sz="4"/>
-          <w:insideH w:val="single" w:color="BFC4C9" w:sz="2"/>
-          <w:insideV w:val="single" w:color="BFC4C9" w:sz="2"/>
+          <w:top w:val="single" w:color="C7CBCF" w:sz="4"/>
+          <w:left w:val="single" w:color="E2E5E8" w:sz="2"/>
+          <w:bottom w:val="single" w:color="C7CBCF" w:sz="4"/>
+          <w:right w:val="single" w:color="E2E5E8" w:sz="2"/>
+          <w:insideH w:val="single" w:color="C7CBCF" w:sz="2"/>
+          <w:insideV w:val="single" w:color="E2E5E8" w:sz="2"/>
         </w:tblBorders>
         <w:tblLayout w:type="fixed"/>
       </w:tblPr>
@@ -390,7 +374,7 @@
         <w:tc>
           <w:tcPr>
             <w:tcW w:type="dxa" w:w="4241"/>
-            <w:shd w:fill="EDF0F2" w:color="auto" w:val="clear"/>
+            <w:shd w:fill="F4F5F6" w:color="auto" w:val="clear"/>
             <w:tcMar>
               <w:top w:type="dxa" w:w="90"/>
               <w:left w:type="dxa" w:w="120"/>
@@ -420,7 +404,7 @@
         <w:tc>
           <w:tcPr>
             <w:tcW w:type="dxa" w:w="5397"/>
-            <w:shd w:fill="EDF0F2" w:color="auto" w:val="clear"/>
+            <w:shd w:fill="F4F5F6" w:color="auto" w:val="clear"/>
             <w:tcMar>
               <w:top w:type="dxa" w:w="90"/>
               <w:left w:type="dxa" w:w="120"/>
@@ -467,7 +451,7 @@
           <w:p>
             <w:pPr>
               <w:spacing w:after="0" w:before="0" w:line="252"/>
-              <w:jc w:val="left"/>
+              <w:jc w:val="both"/>
             </w:pPr>
             <w:r>
               <w:rPr>
@@ -494,7 +478,7 @@
           <w:p>
             <w:pPr>
               <w:spacing w:after="0" w:before="0" w:line="252"/>
-              <w:jc w:val="left"/>
+              <w:jc w:val="both"/>
             </w:pPr>
             <w:r>
               <w:rPr>
@@ -527,7 +511,7 @@
           <w:p>
             <w:pPr>
               <w:spacing w:after="0" w:before="0" w:line="252"/>
-              <w:jc w:val="left"/>
+              <w:jc w:val="both"/>
             </w:pPr>
             <w:r>
               <w:rPr>
@@ -554,7 +538,7 @@
           <w:p>
             <w:pPr>
               <w:spacing w:after="0" w:before="0" w:line="252"/>
-              <w:jc w:val="left"/>
+              <w:jc w:val="both"/>
             </w:pPr>
             <w:r>
               <w:rPr>
@@ -587,7 +571,7 @@
           <w:p>
             <w:pPr>
               <w:spacing w:after="0" w:before="0" w:line="252"/>
-              <w:jc w:val="left"/>
+              <w:jc w:val="both"/>
             </w:pPr>
             <w:r>
               <w:rPr>
@@ -614,7 +598,7 @@
           <w:p>
             <w:pPr>
               <w:spacing w:after="0" w:before="0" w:line="252"/>
-              <w:jc w:val="left"/>
+              <w:jc w:val="both"/>
             </w:pPr>
             <w:r>
               <w:rPr>
@@ -647,7 +631,7 @@
           <w:p>
             <w:pPr>
               <w:spacing w:after="0" w:before="0" w:line="252"/>
-              <w:jc w:val="left"/>
+              <w:jc w:val="both"/>
             </w:pPr>
             <w:r>
               <w:rPr>
@@ -674,7 +658,7 @@
           <w:p>
             <w:pPr>
               <w:spacing w:after="0" w:before="0" w:line="252"/>
-              <w:jc w:val="left"/>
+              <w:jc w:val="both"/>
             </w:pPr>
             <w:r>
               <w:rPr>
@@ -707,7 +691,7 @@
           <w:p>
             <w:pPr>
               <w:spacing w:after="0" w:before="0" w:line="252"/>
-              <w:jc w:val="left"/>
+              <w:jc w:val="both"/>
             </w:pPr>
             <w:r>
               <w:rPr>
@@ -734,7 +718,7 @@
           <w:p>
             <w:pPr>
               <w:spacing w:after="0" w:before="0" w:line="252"/>
-              <w:jc w:val="left"/>
+              <w:jc w:val="both"/>
             </w:pPr>
             <w:r>
               <w:rPr>
@@ -773,10 +757,7 @@
       <w:pPr>
         <w:pStyle w:val="Heading2"/>
         <w:keepNext/>
-        <w:pBdr>
-          <w:bottom w:val="single" w:color="9AA0A6" w:sz="4"/>
-        </w:pBdr>
-        <w:spacing w:after="120" w:before="320"/>
+        <w:spacing w:after="140" w:before="400"/>
       </w:pPr>
       <w:r>
         <w:rPr>
@@ -784,9 +765,9 @@
           <w:b/>
           <w:bCs/>
           <w:color w:val="1A1A1A"/>
-          <w:spacing w:val="14"/>
-          <w:sz w:val="22"/>
-          <w:szCs w:val="22"/>
+          <w:spacing w:val="18"/>
+          <w:sz w:val="21"/>
+          <w:szCs w:val="21"/>
         </w:rPr>
         <w:t xml:space="preserve">DESCRIPCIÓN DE SU RESPONSABILIDAD</w:t>
       </w:r>
@@ -965,10 +946,7 @@
       <w:pPr>
         <w:pStyle w:val="Heading2"/>
         <w:keepNext/>
-        <w:pBdr>
-          <w:bottom w:val="single" w:color="9AA0A6" w:sz="4"/>
-        </w:pBdr>
-        <w:spacing w:after="120" w:before="320"/>
+        <w:spacing w:after="140" w:before="400"/>
       </w:pPr>
       <w:r>
         <w:rPr>
@@ -976,9 +954,9 @@
           <w:b/>
           <w:bCs/>
           <w:color w:val="1A1A1A"/>
-          <w:spacing w:val="14"/>
-          <w:sz w:val="22"/>
-          <w:szCs w:val="22"/>
+          <w:spacing w:val="18"/>
+          <w:sz w:val="21"/>
+          <w:szCs w:val="21"/>
         </w:rPr>
         <w:t xml:space="preserve">DESCRIPCIÓN DE SU AUTORIDAD</w:t>
       </w:r>
@@ -1207,21 +1185,14 @@
     </w:p>
     <w:p>
       <w:pPr>
-        <w:pBdr>
-          <w:bottom w:val="single" w:color="9AA0A6" w:sz="6"/>
-        </w:pBdr>
-        <w:spacing w:after="240" w:before="120"/>
+        <w:spacing w:after="260" w:before="0"/>
       </w:pPr>
     </w:p>
     <w:p>
       <w:pPr>
         <w:pStyle w:val="Heading1"/>
         <w:keepNext/>
-        <w:pBdr>
-          <w:top w:val="single" w:color="9AA0A6" w:sz="8"/>
-          <w:bottom w:val="single" w:color="9AA0A6" w:sz="8"/>
-        </w:pBdr>
-        <w:spacing w:after="200" w:before="400"/>
+        <w:spacing w:after="260" w:before="560"/>
         <w:jc w:val="center"/>
       </w:pPr>
       <w:r>
@@ -1230,9 +1201,9 @@
           <w:b/>
           <w:bCs/>
           <w:color w:val="1A1A1A"/>
-          <w:spacing w:val="20"/>
-          <w:sz w:val="26"/>
-          <w:szCs w:val="26"/>
+          <w:spacing w:val="30"/>
+          <w:sz w:val="25"/>
+          <w:szCs w:val="25"/>
         </w:rPr>
         <w:t xml:space="preserve">ALCANCE DEL PROYECTO</w:t>
       </w:r>
@@ -1241,10 +1212,7 @@
       <w:pPr>
         <w:pStyle w:val="Heading2"/>
         <w:keepNext/>
-        <w:pBdr>
-          <w:bottom w:val="single" w:color="9AA0A6" w:sz="4"/>
-        </w:pBdr>
-        <w:spacing w:after="120" w:before="320"/>
+        <w:spacing w:after="140" w:before="400"/>
       </w:pPr>
       <w:r>
         <w:rPr>
@@ -1252,9 +1220,9 @@
           <w:b/>
           <w:bCs/>
           <w:color w:val="1A1A1A"/>
-          <w:spacing w:val="14"/>
-          <w:sz w:val="22"/>
-          <w:szCs w:val="22"/>
+          <w:spacing w:val="18"/>
+          <w:sz w:val="21"/>
+          <w:szCs w:val="21"/>
         </w:rPr>
         <w:t xml:space="preserve">JUSTIFICACIÓN</w:t>
       </w:r>
@@ -1561,10 +1529,7 @@
       <w:pPr>
         <w:pStyle w:val="Heading2"/>
         <w:keepNext/>
-        <w:pBdr>
-          <w:bottom w:val="single" w:color="9AA0A6" w:sz="4"/>
-        </w:pBdr>
-        <w:spacing w:after="120" w:before="320"/>
+        <w:spacing w:after="140" w:before="400"/>
       </w:pPr>
       <w:r>
         <w:rPr>
@@ -1572,9 +1537,9 @@
           <w:b/>
           <w:bCs/>
           <w:color w:val="1A1A1A"/>
-          <w:spacing w:val="14"/>
-          <w:sz w:val="22"/>
-          <w:szCs w:val="22"/>
+          <w:spacing w:val="18"/>
+          <w:sz w:val="21"/>
+          <w:szCs w:val="21"/>
         </w:rPr>
         <w:t xml:space="preserve">PRODUCTO</w:t>
       </w:r>
@@ -1792,10 +1757,7 @@
       <w:pPr>
         <w:pStyle w:val="Heading2"/>
         <w:keepNext/>
-        <w:pBdr>
-          <w:bottom w:val="single" w:color="9AA0A6" w:sz="4"/>
-        </w:pBdr>
-        <w:spacing w:after="120" w:before="320"/>
+        <w:spacing w:after="140" w:before="400"/>
       </w:pPr>
       <w:r>
         <w:rPr>
@@ -1803,9 +1765,9 @@
           <w:b/>
           <w:bCs/>
           <w:color w:val="1A1A1A"/>
-          <w:spacing w:val="14"/>
-          <w:sz w:val="22"/>
-          <w:szCs w:val="22"/>
+          <w:spacing w:val="18"/>
+          <w:sz w:val="21"/>
+          <w:szCs w:val="21"/>
         </w:rPr>
         <w:t xml:space="preserve">ENTREGABLES</w:t>
       </w:r>
@@ -1829,12 +1791,12 @@
       <w:tblPr>
         <w:tblW w:type="dxa" w:w="9638"/>
         <w:tblBorders>
-          <w:top w:val="single" w:color="BFC4C9" w:sz="4"/>
-          <w:left w:val="single" w:color="BFC4C9" w:sz="4"/>
-          <w:bottom w:val="single" w:color="BFC4C9" w:sz="4"/>
-          <w:right w:val="single" w:color="BFC4C9" w:sz="4"/>
-          <w:insideH w:val="single" w:color="BFC4C9" w:sz="2"/>
-          <w:insideV w:val="single" w:color="BFC4C9" w:sz="2"/>
+          <w:top w:val="single" w:color="C7CBCF" w:sz="4"/>
+          <w:left w:val="single" w:color="E2E5E8" w:sz="2"/>
+          <w:bottom w:val="single" w:color="C7CBCF" w:sz="4"/>
+          <w:right w:val="single" w:color="E2E5E8" w:sz="2"/>
+          <w:insideH w:val="single" w:color="C7CBCF" w:sz="2"/>
+          <w:insideV w:val="single" w:color="E2E5E8" w:sz="2"/>
         </w:tblBorders>
         <w:tblLayout w:type="fixed"/>
       </w:tblPr>
@@ -1850,7 +1812,7 @@
         <w:tc>
           <w:tcPr>
             <w:tcW w:type="dxa" w:w="2891"/>
-            <w:shd w:fill="EDF0F2" w:color="auto" w:val="clear"/>
+            <w:shd w:fill="F4F5F6" w:color="auto" w:val="clear"/>
             <w:tcMar>
               <w:top w:type="dxa" w:w="90"/>
               <w:left w:type="dxa" w:w="120"/>
@@ -1880,7 +1842,7 @@
         <w:tc>
           <w:tcPr>
             <w:tcW w:type="dxa" w:w="6747"/>
-            <w:shd w:fill="EDF0F2" w:color="auto" w:val="clear"/>
+            <w:shd w:fill="F4F5F6" w:color="auto" w:val="clear"/>
             <w:tcMar>
               <w:top w:type="dxa" w:w="90"/>
               <w:left w:type="dxa" w:w="120"/>
@@ -1927,7 +1889,7 @@
           <w:p>
             <w:pPr>
               <w:spacing w:after="0" w:before="0" w:line="252"/>
-              <w:jc w:val="left"/>
+              <w:jc w:val="both"/>
             </w:pPr>
             <w:r>
               <w:rPr>
@@ -1954,7 +1916,7 @@
           <w:p>
             <w:pPr>
               <w:spacing w:after="0" w:before="0" w:line="252"/>
-              <w:jc w:val="left"/>
+              <w:jc w:val="both"/>
             </w:pPr>
             <w:r>
               <w:rPr>
@@ -1987,7 +1949,7 @@
           <w:p>
             <w:pPr>
               <w:spacing w:after="0" w:before="0" w:line="252"/>
-              <w:jc w:val="left"/>
+              <w:jc w:val="both"/>
             </w:pPr>
             <w:r>
               <w:rPr>
@@ -2014,7 +1976,7 @@
           <w:p>
             <w:pPr>
               <w:spacing w:after="0" w:before="0" w:line="252"/>
-              <w:jc w:val="left"/>
+              <w:jc w:val="both"/>
             </w:pPr>
             <w:r>
               <w:rPr>
@@ -2067,7 +2029,7 @@
           <w:p>
             <w:pPr>
               <w:spacing w:after="0" w:before="0" w:line="252"/>
-              <w:jc w:val="left"/>
+              <w:jc w:val="both"/>
             </w:pPr>
             <w:r>
               <w:rPr>
@@ -2094,7 +2056,7 @@
           <w:p>
             <w:pPr>
               <w:spacing w:after="0" w:before="0" w:line="252"/>
-              <w:jc w:val="left"/>
+              <w:jc w:val="both"/>
             </w:pPr>
             <w:r>
               <w:rPr>
@@ -2127,7 +2089,7 @@
           <w:p>
             <w:pPr>
               <w:spacing w:after="0" w:before="0" w:line="252"/>
-              <w:jc w:val="left"/>
+              <w:jc w:val="both"/>
             </w:pPr>
             <w:r>
               <w:rPr>
@@ -2154,7 +2116,7 @@
           <w:p>
             <w:pPr>
               <w:spacing w:after="0" w:before="0" w:line="252"/>
-              <w:jc w:val="left"/>
+              <w:jc w:val="both"/>
             </w:pPr>
             <w:r>
               <w:rPr>
@@ -2187,7 +2149,7 @@
           <w:p>
             <w:pPr>
               <w:spacing w:after="0" w:before="0" w:line="252"/>
-              <w:jc w:val="left"/>
+              <w:jc w:val="both"/>
             </w:pPr>
             <w:r>
               <w:rPr>
@@ -2214,7 +2176,7 @@
           <w:p>
             <w:pPr>
               <w:spacing w:after="0" w:before="0" w:line="252"/>
-              <w:jc w:val="left"/>
+              <w:jc w:val="both"/>
             </w:pPr>
             <w:r>
               <w:rPr>
@@ -2247,7 +2209,7 @@
           <w:p>
             <w:pPr>
               <w:spacing w:after="0" w:before="0" w:line="252"/>
-              <w:jc w:val="left"/>
+              <w:jc w:val="both"/>
             </w:pPr>
             <w:r>
               <w:rPr>
@@ -2274,7 +2236,7 @@
           <w:p>
             <w:pPr>
               <w:spacing w:after="0" w:before="0" w:line="252"/>
-              <w:jc w:val="left"/>
+              <w:jc w:val="both"/>
             </w:pPr>
             <w:r>
               <w:rPr>
@@ -2307,7 +2269,7 @@
           <w:p>
             <w:pPr>
               <w:spacing w:after="0" w:before="0" w:line="252"/>
-              <w:jc w:val="left"/>
+              <w:jc w:val="both"/>
             </w:pPr>
             <w:r>
               <w:rPr>
@@ -2334,7 +2296,7 @@
           <w:p>
             <w:pPr>
               <w:spacing w:after="0" w:before="0" w:line="252"/>
-              <w:jc w:val="left"/>
+              <w:jc w:val="both"/>
             </w:pPr>
             <w:r>
               <w:rPr>
@@ -2367,7 +2329,7 @@
           <w:p>
             <w:pPr>
               <w:spacing w:after="0" w:before="0" w:line="252"/>
-              <w:jc w:val="left"/>
+              <w:jc w:val="both"/>
             </w:pPr>
             <w:r>
               <w:rPr>
@@ -2394,7 +2356,7 @@
           <w:p>
             <w:pPr>
               <w:spacing w:after="0" w:before="0" w:line="252"/>
-              <w:jc w:val="left"/>
+              <w:jc w:val="both"/>
             </w:pPr>
             <w:r>
               <w:rPr>
@@ -2427,7 +2389,7 @@
           <w:p>
             <w:pPr>
               <w:spacing w:after="0" w:before="0" w:line="252"/>
-              <w:jc w:val="left"/>
+              <w:jc w:val="both"/>
             </w:pPr>
             <w:r>
               <w:rPr>
@@ -2454,7 +2416,7 @@
           <w:p>
             <w:pPr>
               <w:spacing w:after="0" w:before="0" w:line="252"/>
-              <w:jc w:val="left"/>
+              <w:jc w:val="both"/>
             </w:pPr>
             <w:r>
               <w:rPr>
@@ -2487,7 +2449,7 @@
           <w:p>
             <w:pPr>
               <w:spacing w:after="0" w:before="0" w:line="252"/>
-              <w:jc w:val="left"/>
+              <w:jc w:val="both"/>
             </w:pPr>
             <w:r>
               <w:rPr>
@@ -2514,7 +2476,7 @@
           <w:p>
             <w:pPr>
               <w:spacing w:after="0" w:before="0" w:line="252"/>
-              <w:jc w:val="left"/>
+              <w:jc w:val="both"/>
             </w:pPr>
             <w:r>
               <w:rPr>
@@ -2547,7 +2509,7 @@
           <w:p>
             <w:pPr>
               <w:spacing w:after="0" w:before="0" w:line="252"/>
-              <w:jc w:val="left"/>
+              <w:jc w:val="both"/>
             </w:pPr>
             <w:r>
               <w:rPr>
@@ -2574,7 +2536,7 @@
           <w:p>
             <w:pPr>
               <w:spacing w:after="0" w:before="0" w:line="252"/>
-              <w:jc w:val="left"/>
+              <w:jc w:val="both"/>
             </w:pPr>
             <w:r>
               <w:rPr>
@@ -2607,7 +2569,7 @@
           <w:p>
             <w:pPr>
               <w:spacing w:after="0" w:before="0" w:line="252"/>
-              <w:jc w:val="left"/>
+              <w:jc w:val="both"/>
             </w:pPr>
             <w:r>
               <w:rPr>
@@ -2634,7 +2596,7 @@
           <w:p>
             <w:pPr>
               <w:spacing w:after="0" w:before="0" w:line="252"/>
-              <w:jc w:val="left"/>
+              <w:jc w:val="both"/>
             </w:pPr>
             <w:r>
               <w:rPr>
@@ -2658,10 +2620,7 @@
       <w:pPr>
         <w:pStyle w:val="Heading2"/>
         <w:keepNext/>
-        <w:pBdr>
-          <w:bottom w:val="single" w:color="9AA0A6" w:sz="4"/>
-        </w:pBdr>
-        <w:spacing w:after="120" w:before="320"/>
+        <w:spacing w:after="140" w:before="400"/>
       </w:pPr>
       <w:r>
         <w:rPr>
@@ -2669,9 +2628,9 @@
           <w:b/>
           <w:bCs/>
           <w:color w:val="1A1A1A"/>
-          <w:spacing w:val="14"/>
-          <w:sz w:val="22"/>
-          <w:szCs w:val="22"/>
+          <w:spacing w:val="18"/>
+          <w:sz w:val="21"/>
+          <w:szCs w:val="21"/>
         </w:rPr>
         <w:t xml:space="preserve">OBJETIVOS</w:t>
       </w:r>
@@ -2680,12 +2639,12 @@
       <w:tblPr>
         <w:tblW w:type="dxa" w:w="9638"/>
         <w:tblBorders>
-          <w:top w:val="single" w:color="BFC4C9" w:sz="4"/>
-          <w:left w:val="single" w:color="BFC4C9" w:sz="4"/>
-          <w:bottom w:val="single" w:color="BFC4C9" w:sz="4"/>
-          <w:right w:val="single" w:color="BFC4C9" w:sz="4"/>
-          <w:insideH w:val="single" w:color="BFC4C9" w:sz="2"/>
-          <w:insideV w:val="single" w:color="BFC4C9" w:sz="2"/>
+          <w:top w:val="single" w:color="C7CBCF" w:sz="4"/>
+          <w:left w:val="single" w:color="E2E5E8" w:sz="2"/>
+          <w:bottom w:val="single" w:color="C7CBCF" w:sz="4"/>
+          <w:right w:val="single" w:color="E2E5E8" w:sz="2"/>
+          <w:insideH w:val="single" w:color="C7CBCF" w:sz="2"/>
+          <w:insideV w:val="single" w:color="E2E5E8" w:sz="2"/>
         </w:tblBorders>
         <w:tblLayout w:type="fixed"/>
       </w:tblPr>
@@ -2705,7 +2664,7 @@
         <w:tc>
           <w:tcPr>
             <w:tcW w:type="dxa" w:w="482"/>
-            <w:shd w:fill="EDF0F2" w:color="auto" w:val="clear"/>
+            <w:shd w:fill="F4F5F6" w:color="auto" w:val="clear"/>
             <w:tcMar>
               <w:top w:type="dxa" w:w="90"/>
               <w:left w:type="dxa" w:w="120"/>
@@ -2735,7 +2694,7 @@
         <w:tc>
           <w:tcPr>
             <w:tcW w:type="dxa" w:w="2120"/>
-            <w:shd w:fill="EDF0F2" w:color="auto" w:val="clear"/>
+            <w:shd w:fill="F4F5F6" w:color="auto" w:val="clear"/>
             <w:tcMar>
               <w:top w:type="dxa" w:w="90"/>
               <w:left w:type="dxa" w:w="120"/>
@@ -2765,7 +2724,7 @@
         <w:tc>
           <w:tcPr>
             <w:tcW w:type="dxa" w:w="2602"/>
-            <w:shd w:fill="EDF0F2" w:color="auto" w:val="clear"/>
+            <w:shd w:fill="F4F5F6" w:color="auto" w:val="clear"/>
             <w:tcMar>
               <w:top w:type="dxa" w:w="90"/>
               <w:left w:type="dxa" w:w="120"/>
@@ -2795,7 +2754,7 @@
         <w:tc>
           <w:tcPr>
             <w:tcW w:type="dxa" w:w="1542"/>
-            <w:shd w:fill="EDF0F2" w:color="auto" w:val="clear"/>
+            <w:shd w:fill="F4F5F6" w:color="auto" w:val="clear"/>
             <w:tcMar>
               <w:top w:type="dxa" w:w="90"/>
               <w:left w:type="dxa" w:w="120"/>
@@ -2825,7 +2784,7 @@
         <w:tc>
           <w:tcPr>
             <w:tcW w:type="dxa" w:w="1253"/>
-            <w:shd w:fill="EDF0F2" w:color="auto" w:val="clear"/>
+            <w:shd w:fill="F4F5F6" w:color="auto" w:val="clear"/>
             <w:tcMar>
               <w:top w:type="dxa" w:w="90"/>
               <w:left w:type="dxa" w:w="120"/>
@@ -2855,7 +2814,7 @@
         <w:tc>
           <w:tcPr>
             <w:tcW w:type="dxa" w:w="1639"/>
-            <w:shd w:fill="EDF0F2" w:color="auto" w:val="clear"/>
+            <w:shd w:fill="F4F5F6" w:color="auto" w:val="clear"/>
             <w:tcMar>
               <w:top w:type="dxa" w:w="90"/>
               <w:left w:type="dxa" w:w="120"/>
@@ -2929,7 +2888,7 @@
           <w:p>
             <w:pPr>
               <w:spacing w:after="0" w:before="0" w:line="252"/>
-              <w:jc w:val="left"/>
+              <w:jc w:val="both"/>
             </w:pPr>
             <w:r>
               <w:rPr>
@@ -2956,7 +2915,7 @@
           <w:p>
             <w:pPr>
               <w:spacing w:after="0" w:before="0" w:line="252"/>
-              <w:jc w:val="left"/>
+              <w:jc w:val="both"/>
             </w:pPr>
             <w:r>
               <w:rPr>
@@ -3108,7 +3067,7 @@
           <w:p>
             <w:pPr>
               <w:spacing w:after="0" w:before="0" w:line="252"/>
-              <w:jc w:val="left"/>
+              <w:jc w:val="both"/>
             </w:pPr>
             <w:r>
               <w:rPr>
@@ -3135,7 +3094,7 @@
           <w:p>
             <w:pPr>
               <w:spacing w:after="0" w:before="0" w:line="252"/>
-              <w:jc w:val="left"/>
+              <w:jc w:val="both"/>
             </w:pPr>
             <w:r>
               <w:rPr>
@@ -3287,7 +3246,7 @@
           <w:p>
             <w:pPr>
               <w:spacing w:after="0" w:before="0" w:line="252"/>
-              <w:jc w:val="left"/>
+              <w:jc w:val="both"/>
             </w:pPr>
             <w:r>
               <w:rPr>
@@ -3314,7 +3273,7 @@
           <w:p>
             <w:pPr>
               <w:spacing w:after="0" w:before="0" w:line="252"/>
-              <w:jc w:val="left"/>
+              <w:jc w:val="both"/>
             </w:pPr>
             <w:r>
               <w:rPr>
@@ -3466,7 +3425,7 @@
           <w:p>
             <w:pPr>
               <w:spacing w:after="0" w:before="0" w:line="252"/>
-              <w:jc w:val="left"/>
+              <w:jc w:val="both"/>
             </w:pPr>
             <w:r>
               <w:rPr>
@@ -3493,7 +3452,7 @@
           <w:p>
             <w:pPr>
               <w:spacing w:after="0" w:before="0" w:line="252"/>
-              <w:jc w:val="left"/>
+              <w:jc w:val="both"/>
             </w:pPr>
             <w:r>
               <w:rPr>
@@ -3616,11 +3575,8 @@
     </w:p>
     <w:p>
       <w:pPr>
-        <w:pBdr>
-          <w:left w:val="single" w:color="9AA0A6" w:sz="12" w:space="14"/>
-        </w:pBdr>
-        <w:spacing w:after="240" w:before="140" w:line="264"/>
-        <w:ind w:left="340" w:right="200"/>
+        <w:spacing w:after="260" w:before="180" w:line="264"/>
+        <w:ind w:left="454" w:right="454"/>
         <w:jc w:val="both"/>
       </w:pPr>
       <w:r>
@@ -3668,10 +3624,7 @@
       <w:pPr>
         <w:pStyle w:val="Heading2"/>
         <w:keepNext/>
-        <w:pBdr>
-          <w:bottom w:val="single" w:color="9AA0A6" w:sz="4"/>
-        </w:pBdr>
-        <w:spacing w:after="120" w:before="320"/>
+        <w:spacing w:after="140" w:before="400"/>
       </w:pPr>
       <w:r>
         <w:rPr>
@@ -3679,9 +3632,9 @@
           <w:b/>
           <w:bCs/>
           <w:color w:val="1A1A1A"/>
-          <w:spacing w:val="14"/>
-          <w:sz w:val="22"/>
-          <w:szCs w:val="22"/>
+          <w:spacing w:val="18"/>
+          <w:sz w:val="21"/>
+          <w:szCs w:val="21"/>
         </w:rPr>
         <w:t xml:space="preserve">LÍMITE</w:t>
       </w:r>
@@ -3883,20 +3836,14 @@
     </w:p>
     <w:p>
       <w:pPr>
-        <w:pBdr>
-          <w:bottom w:val="single" w:color="9AA0A6" w:sz="6"/>
-        </w:pBdr>
-        <w:spacing w:after="240" w:before="120"/>
+        <w:spacing w:after="260" w:before="0"/>
       </w:pPr>
     </w:p>
     <w:p>
       <w:pPr>
         <w:pStyle w:val="Heading2"/>
         <w:keepNext/>
-        <w:pBdr>
-          <w:bottom w:val="single" w:color="9AA0A6" w:sz="4"/>
-        </w:pBdr>
-        <w:spacing w:after="120" w:before="320"/>
+        <w:spacing w:after="140" w:before="400"/>
       </w:pPr>
       <w:r>
         <w:rPr>
@@ -3904,9 +3851,9 @@
           <w:b/>
           <w:bCs/>
           <w:color w:val="1A1A1A"/>
-          <w:spacing w:val="14"/>
-          <w:sz w:val="22"/>
-          <w:szCs w:val="22"/>
+          <w:spacing w:val="18"/>
+          <w:sz w:val="21"/>
+          <w:szCs w:val="21"/>
         </w:rPr>
         <w:t xml:space="preserve">FIRMA AUTORIZANTE</w:t>
       </w:r>

</xml_diff>

<commit_message>
ASI: validación punto 3 de la etapa 3 + preview de docx
</commit_message>
<xml_diff>
--- a/materias/ASI/etapa3-acta-proyecto.docx
+++ b/materias/ASI/etapa3-acta-proyecto.docx
@@ -6,7 +6,7 @@
       <w:pPr>
         <w:pStyle w:val="Heading1"/>
         <w:keepNext/>
-        <w:spacing w:after="260" w:before="560"/>
+        <w:spacing w:after="220" w:before="380"/>
         <w:jc w:val="center"/>
       </w:pPr>
       <w:r>
@@ -18,14 +18,15 @@
           <w:spacing w:val="30"/>
           <w:sz w:val="25"/>
           <w:szCs w:val="25"/>
+          <w:lang w:val="es-AR"/>
         </w:rPr>
         <w:t xml:space="preserve">ACTA DEL PROYECTO</w:t>
       </w:r>
     </w:p>
     <w:p>
       <w:pPr>
-        <w:spacing w:after="140" w:line="288"/>
-        <w:jc w:val="both"/>
+        <w:spacing w:after="260" w:line="288"/>
+        <w:jc w:val="center"/>
       </w:pPr>
       <w:r>
         <w:rPr>
@@ -35,20 +36,21 @@
           <w:color w:val="1A1A1A"/>
           <w:sz w:val="22"/>
           <w:szCs w:val="22"/>
+          <w:lang w:val="es-AR"/>
         </w:rPr>
         <w:t xml:space="preserve">Implementación de la Plataforma de Gestión de Órdenes de Trabajo de Campo (OT-Campo) para el proceso de instalación de internet con fibra óptica</w:t>
       </w:r>
     </w:p>
     <w:p>
       <w:pPr>
-        <w:spacing w:after="260" w:before="0"/>
+        <w:spacing w:after="160" w:before="0"/>
       </w:pPr>
     </w:p>
     <w:p>
       <w:pPr>
         <w:pStyle w:val="Heading2"/>
         <w:keepNext/>
-        <w:spacing w:after="140" w:before="400"/>
+        <w:spacing w:after="120" w:before="300"/>
       </w:pPr>
       <w:r>
         <w:rPr>
@@ -59,13 +61,14 @@
           <w:spacing w:val="18"/>
           <w:sz w:val="21"/>
           <w:szCs w:val="21"/>
+          <w:lang w:val="es-AR"/>
         </w:rPr>
         <w:t xml:space="preserve">DE</w:t>
       </w:r>
     </w:p>
     <w:p>
       <w:pPr>
-        <w:spacing w:after="140" w:line="288"/>
+        <w:spacing w:after="120" w:line="280"/>
         <w:jc w:val="both"/>
       </w:pPr>
       <w:r>
@@ -76,6 +79,7 @@
           <w:color w:val="1A1A1A"/>
           <w:sz w:val="22"/>
           <w:szCs w:val="22"/>
+          <w:lang w:val="es-AR"/>
         </w:rPr>
         <w:t xml:space="preserve">Gerencia de Operaciones</w:t>
       </w:r>
@@ -85,13 +89,14 @@
           <w:color w:val="1A1A1A"/>
           <w:sz w:val="22"/>
           <w:szCs w:val="22"/>
+          <w:lang w:val="es-AR"/>
         </w:rPr>
         <w:t xml:space="preserve"> — Personal (Telecom Argentina)</w:t>
       </w:r>
     </w:p>
     <w:p>
       <w:pPr>
-        <w:spacing w:after="140" w:line="288"/>
+        <w:spacing w:after="120" w:line="280"/>
         <w:jc w:val="both"/>
       </w:pPr>
       <w:r>
@@ -102,6 +107,7 @@
           <w:color w:val="1A1A1A"/>
           <w:sz w:val="22"/>
           <w:szCs w:val="22"/>
+          <w:lang w:val="es-AR"/>
         </w:rPr>
         <w:t xml:space="preserve">Patrocinador del proyecto. Es el área titular del proceso crítico afectado y de los objetivos de negocio que el proyecto compromete.</w:t>
       </w:r>
@@ -110,7 +116,7 @@
       <w:pPr>
         <w:pStyle w:val="Heading2"/>
         <w:keepNext/>
-        <w:spacing w:after="140" w:before="400"/>
+        <w:spacing w:after="120" w:before="300"/>
       </w:pPr>
       <w:r>
         <w:rPr>
@@ -121,21 +127,23 @@
           <w:spacing w:val="18"/>
           <w:sz w:val="21"/>
           <w:szCs w:val="21"/>
+          <w:lang w:val="es-AR"/>
         </w:rPr>
         <w:t xml:space="preserve">PARA</w:t>
       </w:r>
     </w:p>
     <w:p>
       <w:pPr>
-        <w:spacing w:after="140" w:line="288"/>
-        <w:jc w:val="both"/>
-      </w:pPr>
-      <w:r>
-        <w:rPr>
-          <w:rFonts w:ascii="Arial" w:cs="Arial" w:eastAsia="Arial" w:hAnsi="Arial"/>
-          <w:color w:val="1A1A1A"/>
-          <w:sz w:val="22"/>
-          <w:szCs w:val="22"/>
+        <w:spacing w:after="120" w:line="280"/>
+        <w:jc w:val="both"/>
+      </w:pPr>
+      <w:r>
+        <w:rPr>
+          <w:rFonts w:ascii="Arial" w:cs="Arial" w:eastAsia="Arial" w:hAnsi="Arial"/>
+          <w:color w:val="1A1A1A"/>
+          <w:sz w:val="22"/>
+          <w:szCs w:val="22"/>
+          <w:lang w:val="es-AR"/>
         </w:rPr>
         <w:t xml:space="preserve">Integrantes de las áreas de la organización que deben tomar conocimiento del proyecto:</w:t>
       </w:r>
@@ -156,6 +164,7 @@
           <w:color w:val="1A1A1A"/>
           <w:sz w:val="22"/>
           <w:szCs w:val="22"/>
+          <w:lang w:val="es-AR"/>
         </w:rPr>
         <w:t xml:space="preserve">Gerencia de Operaciones — Supervisión de Instalaciones</w:t>
       </w:r>
@@ -176,6 +185,7 @@
           <w:color w:val="1A1A1A"/>
           <w:sz w:val="22"/>
           <w:szCs w:val="22"/>
+          <w:lang w:val="es-AR"/>
         </w:rPr>
         <w:t xml:space="preserve">Gerencia de Tecnología y Sistemas — Desarrollo, Infraestructura y Seguridad de la Información</w:t>
       </w:r>
@@ -196,6 +206,7 @@
           <w:color w:val="1A1A1A"/>
           <w:sz w:val="22"/>
           <w:szCs w:val="22"/>
+          <w:lang w:val="es-AR"/>
         </w:rPr>
         <w:t xml:space="preserve">Centro de Operaciones de Red (NOC)</w:t>
       </w:r>
@@ -216,6 +227,7 @@
           <w:color w:val="1A1A1A"/>
           <w:sz w:val="22"/>
           <w:szCs w:val="22"/>
+          <w:lang w:val="es-AR"/>
         </w:rPr>
         <w:t xml:space="preserve">Gerencia Comercial — Atención al Cliente</w:t>
       </w:r>
@@ -236,6 +248,7 @@
           <w:color w:val="1A1A1A"/>
           <w:sz w:val="22"/>
           <w:szCs w:val="22"/>
+          <w:lang w:val="es-AR"/>
         </w:rPr>
         <w:t xml:space="preserve">Logística y Almacenes</w:t>
       </w:r>
@@ -256,6 +269,7 @@
           <w:color w:val="1A1A1A"/>
           <w:sz w:val="22"/>
           <w:szCs w:val="22"/>
+          <w:lang w:val="es-AR"/>
         </w:rPr>
         <w:t xml:space="preserve">Compras y Abastecimiento</w:t>
       </w:r>
@@ -276,6 +290,7 @@
           <w:color w:val="1A1A1A"/>
           <w:sz w:val="22"/>
           <w:szCs w:val="22"/>
+          <w:lang w:val="es-AR"/>
         </w:rPr>
         <w:t xml:space="preserve">Recursos Humanos</w:t>
       </w:r>
@@ -296,21 +311,23 @@
           <w:color w:val="1A1A1A"/>
           <w:sz w:val="22"/>
           <w:szCs w:val="22"/>
+          <w:lang w:val="es-AR"/>
         </w:rPr>
         <w:t xml:space="preserve">Servicio de Higiene y Seguridad Laboral</w:t>
       </w:r>
     </w:p>
     <w:p>
       <w:pPr>
-        <w:spacing w:after="140" w:line="288"/>
-        <w:jc w:val="both"/>
-      </w:pPr>
-      <w:r>
-        <w:rPr>
-          <w:rFonts w:ascii="Arial" w:cs="Arial" w:eastAsia="Arial" w:hAnsi="Arial"/>
-          <w:color w:val="1A1A1A"/>
-          <w:sz w:val="22"/>
-          <w:szCs w:val="22"/>
+        <w:spacing w:after="120" w:line="280"/>
+        <w:jc w:val="both"/>
+      </w:pPr>
+      <w:r>
+        <w:rPr>
+          <w:rFonts w:ascii="Arial" w:cs="Arial" w:eastAsia="Arial" w:hAnsi="Arial"/>
+          <w:color w:val="1A1A1A"/>
+          <w:sz w:val="22"/>
+          <w:szCs w:val="22"/>
+          <w:lang w:val="es-AR"/>
         </w:rPr>
         <w:t xml:space="preserve">Y el equipo del proyecto, inicialmente conformado por las personas indicadas en el apartado DESIGNACIÓN.</w:t>
       </w:r>
@@ -319,7 +336,7 @@
       <w:pPr>
         <w:pStyle w:val="Heading2"/>
         <w:keepNext/>
-        <w:spacing w:after="140" w:before="400"/>
+        <w:spacing w:after="120" w:before="300"/>
       </w:pPr>
       <w:r>
         <w:rPr>
@@ -330,21 +347,23 @@
           <w:spacing w:val="18"/>
           <w:sz w:val="21"/>
           <w:szCs w:val="21"/>
+          <w:lang w:val="es-AR"/>
         </w:rPr>
         <w:t xml:space="preserve">DESIGNACIÓN</w:t>
       </w:r>
     </w:p>
     <w:p>
       <w:pPr>
-        <w:spacing w:after="140" w:line="288"/>
-        <w:jc w:val="both"/>
-      </w:pPr>
-      <w:r>
-        <w:rPr>
-          <w:rFonts w:ascii="Arial" w:cs="Arial" w:eastAsia="Arial" w:hAnsi="Arial"/>
-          <w:color w:val="1A1A1A"/>
-          <w:sz w:val="22"/>
-          <w:szCs w:val="22"/>
+        <w:spacing w:after="120" w:line="280"/>
+        <w:jc w:val="both"/>
+      </w:pPr>
+      <w:r>
+        <w:rPr>
+          <w:rFonts w:ascii="Arial" w:cs="Arial" w:eastAsia="Arial" w:hAnsi="Arial"/>
+          <w:color w:val="1A1A1A"/>
+          <w:sz w:val="22"/>
+          <w:szCs w:val="22"/>
+          <w:lang w:val="es-AR"/>
         </w:rPr>
         <w:t xml:space="preserve">El patrocinador designa los siguientes roles para la ejecución del proyecto:</w:t>
       </w:r>
@@ -385,6 +404,8 @@
           </w:tcPr>
           <w:p>
             <w:pPr>
+              <w:keepNext/>
+              <w:suppressAutoHyphens/>
               <w:spacing w:after="0" w:before="0" w:line="252"/>
               <w:jc w:val="left"/>
             </w:pPr>
@@ -396,6 +417,7 @@
                 <w:color w:val="1A1A1A"/>
                 <w:sz w:val="18"/>
                 <w:szCs w:val="18"/>
+                <w:lang w:val="es-AR"/>
               </w:rPr>
               <w:t xml:space="preserve">Rol designado</w:t>
             </w:r>
@@ -415,6 +437,8 @@
           </w:tcPr>
           <w:p>
             <w:pPr>
+              <w:keepNext/>
+              <w:suppressAutoHyphens/>
               <w:spacing w:after="0" w:before="0" w:line="252"/>
               <w:jc w:val="left"/>
             </w:pPr>
@@ -426,6 +450,7 @@
                 <w:color w:val="1A1A1A"/>
                 <w:sz w:val="18"/>
                 <w:szCs w:val="18"/>
+                <w:lang w:val="es-AR"/>
               </w:rPr>
               <w:t xml:space="preserve">Área de procedencia</w:t>
             </w:r>
@@ -450,15 +475,18 @@
           </w:tcPr>
           <w:p>
             <w:pPr>
-              <w:spacing w:after="0" w:before="0" w:line="252"/>
-              <w:jc w:val="both"/>
-            </w:pPr>
-            <w:r>
-              <w:rPr>
-                <w:rFonts w:ascii="Arial" w:cs="Arial" w:eastAsia="Arial" w:hAnsi="Arial"/>
-                <w:color w:val="1A1A1A"/>
-                <w:sz w:val="18"/>
-                <w:szCs w:val="18"/>
+              <w:keepNext/>
+              <w:suppressAutoHyphens/>
+              <w:spacing w:after="0" w:before="0" w:line="252"/>
+              <w:jc w:val="left"/>
+            </w:pPr>
+            <w:r>
+              <w:rPr>
+                <w:rFonts w:ascii="Arial" w:cs="Arial" w:eastAsia="Arial" w:hAnsi="Arial"/>
+                <w:color w:val="1A1A1A"/>
+                <w:sz w:val="18"/>
+                <w:szCs w:val="18"/>
+                <w:lang w:val="es-AR"/>
               </w:rPr>
               <w:t xml:space="preserve">Director de Proyecto</w:t>
             </w:r>
@@ -477,15 +505,18 @@
           </w:tcPr>
           <w:p>
             <w:pPr>
-              <w:spacing w:after="0" w:before="0" w:line="252"/>
-              <w:jc w:val="both"/>
-            </w:pPr>
-            <w:r>
-              <w:rPr>
-                <w:rFonts w:ascii="Arial" w:cs="Arial" w:eastAsia="Arial" w:hAnsi="Arial"/>
-                <w:color w:val="1A1A1A"/>
-                <w:sz w:val="18"/>
-                <w:szCs w:val="18"/>
+              <w:keepNext/>
+              <w:suppressAutoHyphens/>
+              <w:spacing w:after="0" w:before="0" w:line="252"/>
+              <w:jc w:val="left"/>
+            </w:pPr>
+            <w:r>
+              <w:rPr>
+                <w:rFonts w:ascii="Arial" w:cs="Arial" w:eastAsia="Arial" w:hAnsi="Arial"/>
+                <w:color w:val="1A1A1A"/>
+                <w:sz w:val="18"/>
+                <w:szCs w:val="18"/>
+                <w:lang w:val="es-AR"/>
               </w:rPr>
               <w:t xml:space="preserve">Gerencia de Tecnología y Sistemas</w:t>
             </w:r>
@@ -510,15 +541,18 @@
           </w:tcPr>
           <w:p>
             <w:pPr>
-              <w:spacing w:after="0" w:before="0" w:line="252"/>
-              <w:jc w:val="both"/>
-            </w:pPr>
-            <w:r>
-              <w:rPr>
-                <w:rFonts w:ascii="Arial" w:cs="Arial" w:eastAsia="Arial" w:hAnsi="Arial"/>
-                <w:color w:val="1A1A1A"/>
-                <w:sz w:val="18"/>
-                <w:szCs w:val="18"/>
+              <w:keepNext/>
+              <w:suppressAutoHyphens/>
+              <w:spacing w:after="0" w:before="0" w:line="252"/>
+              <w:jc w:val="left"/>
+            </w:pPr>
+            <w:r>
+              <w:rPr>
+                <w:rFonts w:ascii="Arial" w:cs="Arial" w:eastAsia="Arial" w:hAnsi="Arial"/>
+                <w:color w:val="1A1A1A"/>
+                <w:sz w:val="18"/>
+                <w:szCs w:val="18"/>
+                <w:lang w:val="es-AR"/>
               </w:rPr>
               <w:t xml:space="preserve">Arquitecto de Software / Líder Técnico</w:t>
             </w:r>
@@ -537,15 +571,18 @@
           </w:tcPr>
           <w:p>
             <w:pPr>
-              <w:spacing w:after="0" w:before="0" w:line="252"/>
-              <w:jc w:val="both"/>
-            </w:pPr>
-            <w:r>
-              <w:rPr>
-                <w:rFonts w:ascii="Arial" w:cs="Arial" w:eastAsia="Arial" w:hAnsi="Arial"/>
-                <w:color w:val="1A1A1A"/>
-                <w:sz w:val="18"/>
-                <w:szCs w:val="18"/>
+              <w:keepNext/>
+              <w:suppressAutoHyphens/>
+              <w:spacing w:after="0" w:before="0" w:line="252"/>
+              <w:jc w:val="left"/>
+            </w:pPr>
+            <w:r>
+              <w:rPr>
+                <w:rFonts w:ascii="Arial" w:cs="Arial" w:eastAsia="Arial" w:hAnsi="Arial"/>
+                <w:color w:val="1A1A1A"/>
+                <w:sz w:val="18"/>
+                <w:szCs w:val="18"/>
+                <w:lang w:val="es-AR"/>
               </w:rPr>
               <w:t xml:space="preserve">Gerencia de Tecnología y Sistemas — Desarrollo</w:t>
             </w:r>
@@ -570,15 +607,18 @@
           </w:tcPr>
           <w:p>
             <w:pPr>
-              <w:spacing w:after="0" w:before="0" w:line="252"/>
-              <w:jc w:val="both"/>
-            </w:pPr>
-            <w:r>
-              <w:rPr>
-                <w:rFonts w:ascii="Arial" w:cs="Arial" w:eastAsia="Arial" w:hAnsi="Arial"/>
-                <w:color w:val="1A1A1A"/>
-                <w:sz w:val="18"/>
-                <w:szCs w:val="18"/>
+              <w:keepNext/>
+              <w:suppressAutoHyphens/>
+              <w:spacing w:after="0" w:before="0" w:line="252"/>
+              <w:jc w:val="left"/>
+            </w:pPr>
+            <w:r>
+              <w:rPr>
+                <w:rFonts w:ascii="Arial" w:cs="Arial" w:eastAsia="Arial" w:hAnsi="Arial"/>
+                <w:color w:val="1A1A1A"/>
+                <w:sz w:val="18"/>
+                <w:szCs w:val="18"/>
+                <w:lang w:val="es-AR"/>
               </w:rPr>
               <w:t xml:space="preserve">Analista Funcional</w:t>
             </w:r>
@@ -597,15 +637,18 @@
           </w:tcPr>
           <w:p>
             <w:pPr>
-              <w:spacing w:after="0" w:before="0" w:line="252"/>
-              <w:jc w:val="both"/>
-            </w:pPr>
-            <w:r>
-              <w:rPr>
-                <w:rFonts w:ascii="Arial" w:cs="Arial" w:eastAsia="Arial" w:hAnsi="Arial"/>
-                <w:color w:val="1A1A1A"/>
-                <w:sz w:val="18"/>
-                <w:szCs w:val="18"/>
+              <w:keepNext/>
+              <w:suppressAutoHyphens/>
+              <w:spacing w:after="0" w:before="0" w:line="252"/>
+              <w:jc w:val="left"/>
+            </w:pPr>
+            <w:r>
+              <w:rPr>
+                <w:rFonts w:ascii="Arial" w:cs="Arial" w:eastAsia="Arial" w:hAnsi="Arial"/>
+                <w:color w:val="1A1A1A"/>
+                <w:sz w:val="18"/>
+                <w:szCs w:val="18"/>
+                <w:lang w:val="es-AR"/>
               </w:rPr>
               <w:t xml:space="preserve">Gerencia de Tecnología y Sistemas — Desarrollo</w:t>
             </w:r>
@@ -630,15 +673,18 @@
           </w:tcPr>
           <w:p>
             <w:pPr>
-              <w:spacing w:after="0" w:before="0" w:line="252"/>
-              <w:jc w:val="both"/>
-            </w:pPr>
-            <w:r>
-              <w:rPr>
-                <w:rFonts w:ascii="Arial" w:cs="Arial" w:eastAsia="Arial" w:hAnsi="Arial"/>
-                <w:color w:val="1A1A1A"/>
-                <w:sz w:val="18"/>
-                <w:szCs w:val="18"/>
+              <w:keepNext/>
+              <w:suppressAutoHyphens/>
+              <w:spacing w:after="0" w:before="0" w:line="252"/>
+              <w:jc w:val="left"/>
+            </w:pPr>
+            <w:r>
+              <w:rPr>
+                <w:rFonts w:ascii="Arial" w:cs="Arial" w:eastAsia="Arial" w:hAnsi="Arial"/>
+                <w:color w:val="1A1A1A"/>
+                <w:sz w:val="18"/>
+                <w:szCs w:val="18"/>
+                <w:lang w:val="es-AR"/>
               </w:rPr>
               <w:t xml:space="preserve">Responsable de Seguridad de la Información</w:t>
             </w:r>
@@ -657,15 +703,18 @@
           </w:tcPr>
           <w:p>
             <w:pPr>
-              <w:spacing w:after="0" w:before="0" w:line="252"/>
-              <w:jc w:val="both"/>
-            </w:pPr>
-            <w:r>
-              <w:rPr>
-                <w:rFonts w:ascii="Arial" w:cs="Arial" w:eastAsia="Arial" w:hAnsi="Arial"/>
-                <w:color w:val="1A1A1A"/>
-                <w:sz w:val="18"/>
-                <w:szCs w:val="18"/>
+              <w:keepNext/>
+              <w:suppressAutoHyphens/>
+              <w:spacing w:after="0" w:before="0" w:line="252"/>
+              <w:jc w:val="left"/>
+            </w:pPr>
+            <w:r>
+              <w:rPr>
+                <w:rFonts w:ascii="Arial" w:cs="Arial" w:eastAsia="Arial" w:hAnsi="Arial"/>
+                <w:color w:val="1A1A1A"/>
+                <w:sz w:val="18"/>
+                <w:szCs w:val="18"/>
+                <w:lang w:val="es-AR"/>
               </w:rPr>
               <w:t xml:space="preserve">Gerencia de Tecnología y Sistemas — Seguridad de la Información</w:t>
             </w:r>
@@ -690,15 +739,18 @@
           </w:tcPr>
           <w:p>
             <w:pPr>
-              <w:spacing w:after="0" w:before="0" w:line="252"/>
-              <w:jc w:val="both"/>
-            </w:pPr>
-            <w:r>
-              <w:rPr>
-                <w:rFonts w:ascii="Arial" w:cs="Arial" w:eastAsia="Arial" w:hAnsi="Arial"/>
-                <w:color w:val="1A1A1A"/>
-                <w:sz w:val="18"/>
-                <w:szCs w:val="18"/>
+              <w:keepNext w:val="false"/>
+              <w:suppressAutoHyphens/>
+              <w:spacing w:after="0" w:before="0" w:line="252"/>
+              <w:jc w:val="left"/>
+            </w:pPr>
+            <w:r>
+              <w:rPr>
+                <w:rFonts w:ascii="Arial" w:cs="Arial" w:eastAsia="Arial" w:hAnsi="Arial"/>
+                <w:color w:val="1A1A1A"/>
+                <w:sz w:val="18"/>
+                <w:szCs w:val="18"/>
+                <w:lang w:val="es-AR"/>
               </w:rPr>
               <w:t xml:space="preserve">Referente de Operaciones</w:t>
             </w:r>
@@ -717,15 +769,18 @@
           </w:tcPr>
           <w:p>
             <w:pPr>
-              <w:spacing w:after="0" w:before="0" w:line="252"/>
-              <w:jc w:val="both"/>
-            </w:pPr>
-            <w:r>
-              <w:rPr>
-                <w:rFonts w:ascii="Arial" w:cs="Arial" w:eastAsia="Arial" w:hAnsi="Arial"/>
-                <w:color w:val="1A1A1A"/>
-                <w:sz w:val="18"/>
-                <w:szCs w:val="18"/>
+              <w:keepNext w:val="false"/>
+              <w:suppressAutoHyphens/>
+              <w:spacing w:after="0" w:before="0" w:line="252"/>
+              <w:jc w:val="left"/>
+            </w:pPr>
+            <w:r>
+              <w:rPr>
+                <w:rFonts w:ascii="Arial" w:cs="Arial" w:eastAsia="Arial" w:hAnsi="Arial"/>
+                <w:color w:val="1A1A1A"/>
+                <w:sz w:val="18"/>
+                <w:szCs w:val="18"/>
+                <w:lang w:val="es-AR"/>
               </w:rPr>
               <w:t xml:space="preserve">Gerencia de Operaciones — Supervisión de Instalaciones</w:t>
             </w:r>
@@ -735,20 +790,21 @@
     </w:tbl>
     <w:p>
       <w:pPr>
-        <w:spacing w:after="200"/>
-      </w:pPr>
-    </w:p>
-    <w:p>
-      <w:pPr>
-        <w:spacing w:after="140" w:line="288"/>
-        <w:jc w:val="both"/>
-      </w:pPr>
-      <w:r>
-        <w:rPr>
-          <w:rFonts w:ascii="Arial" w:cs="Arial" w:eastAsia="Arial" w:hAnsi="Arial"/>
-          <w:color w:val="1A1A1A"/>
-          <w:sz w:val="22"/>
-          <w:szCs w:val="22"/>
+        <w:spacing w:after="160"/>
+      </w:pPr>
+    </w:p>
+    <w:p>
+      <w:pPr>
+        <w:spacing w:after="120" w:line="280"/>
+        <w:jc w:val="both"/>
+      </w:pPr>
+      <w:r>
+        <w:rPr>
+          <w:rFonts w:ascii="Arial" w:cs="Arial" w:eastAsia="Arial" w:hAnsi="Arial"/>
+          <w:color w:val="1A1A1A"/>
+          <w:sz w:val="22"/>
+          <w:szCs w:val="22"/>
+          <w:lang w:val="es-AR"/>
         </w:rPr>
         <w:t xml:space="preserve">El resto del equipo —desarrollo, experiencia de usuario, datos, pruebas, infraestructura y capacitación— es conformado por el Director de Proyecto según los perfiles y competencias descriptos en el punto 5 de esta etapa.</w:t>
       </w:r>
@@ -757,7 +813,7 @@
       <w:pPr>
         <w:pStyle w:val="Heading2"/>
         <w:keepNext/>
-        <w:spacing w:after="140" w:before="400"/>
+        <w:spacing w:after="120" w:before="300"/>
       </w:pPr>
       <w:r>
         <w:rPr>
@@ -768,13 +824,14 @@
           <w:spacing w:val="18"/>
           <w:sz w:val="21"/>
           <w:szCs w:val="21"/>
+          <w:lang w:val="es-AR"/>
         </w:rPr>
         <w:t xml:space="preserve">DESCRIPCIÓN DE SU RESPONSABILIDAD</w:t>
       </w:r>
     </w:p>
     <w:p>
       <w:pPr>
-        <w:spacing w:after="140" w:line="288"/>
+        <w:spacing w:after="120" w:line="280"/>
         <w:jc w:val="both"/>
       </w:pPr>
       <w:r>
@@ -785,6 +842,7 @@
           <w:color w:val="1A1A1A"/>
           <w:sz w:val="22"/>
           <w:szCs w:val="22"/>
+          <w:lang w:val="es-AR"/>
         </w:rPr>
         <w:t xml:space="preserve">Director de Proyecto.</w:t>
       </w:r>
@@ -794,6 +852,7 @@
           <w:color w:val="1A1A1A"/>
           <w:sz w:val="22"/>
           <w:szCs w:val="22"/>
+          <w:lang w:val="es-AR"/>
         </w:rPr>
         <w:t xml:space="preserve"> Dirigir el proyecto y </w:t>
       </w:r>
@@ -805,6 +864,7 @@
           <w:color w:val="1A1A1A"/>
           <w:sz w:val="22"/>
           <w:szCs w:val="22"/>
+          <w:lang w:val="es-AR"/>
         </w:rPr>
         <w:t xml:space="preserve">conformar el equipo que lo llevará adelante</w:t>
       </w:r>
@@ -814,13 +874,14 @@
           <w:color w:val="1A1A1A"/>
           <w:sz w:val="22"/>
           <w:szCs w:val="22"/>
+          <w:lang w:val="es-AR"/>
         </w:rPr>
         <w:t xml:space="preserve">: desarrollo, diseño de experiencia de usuario, datos, pruebas, infraestructura y capacitación. Los perfiles y competencias de ese equipo se detallan en el punto 5 de esta etapa. Es responsable de la planificación, del cumplimiento del cronograma, del presupuesto aprobado, de la gestión de riesgos y de las comunicaciones con el patrocinador y las áreas involucradas. Responde por la entrega de los entregables comprometidos en este Acta.</w:t>
       </w:r>
     </w:p>
     <w:p>
       <w:pPr>
-        <w:spacing w:after="140" w:line="288"/>
+        <w:spacing w:after="120" w:line="280"/>
         <w:jc w:val="both"/>
       </w:pPr>
       <w:r>
@@ -831,6 +892,7 @@
           <w:color w:val="1A1A1A"/>
           <w:sz w:val="22"/>
           <w:szCs w:val="22"/>
+          <w:lang w:val="es-AR"/>
         </w:rPr>
         <w:t xml:space="preserve">Arquitecto de Software / Líder Técnico.</w:t>
       </w:r>
@@ -840,13 +902,14 @@
           <w:color w:val="1A1A1A"/>
           <w:sz w:val="22"/>
           <w:szCs w:val="22"/>
+          <w:lang w:val="es-AR"/>
         </w:rPr>
         <w:t xml:space="preserve"> Definir la arquitectura de la plataforma y de las integraciones con SGOT, CRM, la base de datos de clientes y órdenes de trabajo, y el sistema de gestión de red (NMS). Conducir técnicamente al equipo de desarrollo que designe el Director de Proyecto y responder por la calidad técnica de los entregables.</w:t>
       </w:r>
     </w:p>
     <w:p>
       <w:pPr>
-        <w:spacing w:after="140" w:line="288"/>
+        <w:spacing w:after="120" w:line="280"/>
         <w:jc w:val="both"/>
       </w:pPr>
       <w:r>
@@ -857,6 +920,7 @@
           <w:color w:val="1A1A1A"/>
           <w:sz w:val="22"/>
           <w:szCs w:val="22"/>
+          <w:lang w:val="es-AR"/>
         </w:rPr>
         <w:t xml:space="preserve">Analista Funcional.</w:t>
       </w:r>
@@ -866,6 +930,7 @@
           <w:color w:val="1A1A1A"/>
           <w:sz w:val="22"/>
           <w:szCs w:val="22"/>
+          <w:lang w:val="es-AR"/>
         </w:rPr>
         <w:t xml:space="preserve"> Relevar y validar los requerimientos con Supervisión de Instalaciones, técnicos de campo, NOC y Logística. Responsable de la </w:t>
       </w:r>
@@ -877,6 +942,7 @@
           <w:color w:val="1A1A1A"/>
           <w:sz w:val="22"/>
           <w:szCs w:val="22"/>
+          <w:lang w:val="es-AR"/>
         </w:rPr>
         <w:t xml:space="preserve">medición de las líneas base</w:t>
       </w:r>
@@ -886,13 +952,14 @@
           <w:color w:val="1A1A1A"/>
           <w:sz w:val="22"/>
           <w:szCs w:val="22"/>
+          <w:lang w:val="es-AR"/>
         </w:rPr>
         <w:t xml:space="preserve"> de los indicadores comprometidos en los objetivos, y de la definición de las reglas de priorización y del motor de asignación.</w:t>
       </w:r>
     </w:p>
     <w:p>
       <w:pPr>
-        <w:spacing w:after="140" w:line="288"/>
+        <w:spacing w:after="120" w:line="280"/>
         <w:jc w:val="both"/>
       </w:pPr>
       <w:r>
@@ -903,6 +970,7 @@
           <w:color w:val="1A1A1A"/>
           <w:sz w:val="22"/>
           <w:szCs w:val="22"/>
+          <w:lang w:val="es-AR"/>
         </w:rPr>
         <w:t xml:space="preserve">Responsable de Seguridad de la Información.</w:t>
       </w:r>
@@ -912,13 +980,14 @@
           <w:color w:val="1A1A1A"/>
           <w:sz w:val="22"/>
           <w:szCs w:val="22"/>
+          <w:lang w:val="es-AR"/>
         </w:rPr>
         <w:t xml:space="preserve"> Definir e implementar los controles de acceso, autenticación y auditoría de la plataforma, incluida la baja automática de credenciales integrada con Recursos Humanos. Verificar el cumplimiento de la Ley 25.326 de Protección de Datos Personales sobre los datos de clientes que la aplicación de campo trata.</w:t>
       </w:r>
     </w:p>
     <w:p>
       <w:pPr>
-        <w:spacing w:after="140" w:line="288"/>
+        <w:spacing w:after="120" w:line="280"/>
         <w:jc w:val="both"/>
       </w:pPr>
       <w:r>
@@ -929,6 +998,7 @@
           <w:color w:val="1A1A1A"/>
           <w:sz w:val="22"/>
           <w:szCs w:val="22"/>
+          <w:lang w:val="es-AR"/>
         </w:rPr>
         <w:t xml:space="preserve">Referente de Operaciones.</w:t>
       </w:r>
@@ -938,6 +1008,7 @@
           <w:color w:val="1A1A1A"/>
           <w:sz w:val="22"/>
           <w:szCs w:val="22"/>
+          <w:lang w:val="es-AR"/>
         </w:rPr>
         <w:t xml:space="preserve"> Ser el nexo entre el equipo del proyecto y la operación. Facilitar el acceso a la información del proceso, a los técnicos y a las zonas de trabajo; coordinar el piloto y validar funcionalmente los entregables antes de su aceptación.</w:t>
       </w:r>
@@ -946,7 +1017,7 @@
       <w:pPr>
         <w:pStyle w:val="Heading2"/>
         <w:keepNext/>
-        <w:spacing w:after="140" w:before="400"/>
+        <w:spacing w:after="120" w:before="300"/>
       </w:pPr>
       <w:r>
         <w:rPr>
@@ -957,13 +1028,14 @@
           <w:spacing w:val="18"/>
           <w:sz w:val="21"/>
           <w:szCs w:val="21"/>
+          <w:lang w:val="es-AR"/>
         </w:rPr>
         <w:t xml:space="preserve">DESCRIPCIÓN DE SU AUTORIDAD</w:t>
       </w:r>
     </w:p>
     <w:p>
       <w:pPr>
-        <w:spacing w:after="140" w:line="288"/>
+        <w:spacing w:after="120" w:line="280"/>
         <w:jc w:val="both"/>
       </w:pPr>
       <w:r>
@@ -974,6 +1046,7 @@
           <w:color w:val="1A1A1A"/>
           <w:sz w:val="22"/>
           <w:szCs w:val="22"/>
+          <w:lang w:val="es-AR"/>
         </w:rPr>
         <w:t xml:space="preserve">Director de Proyecto.</w:t>
       </w:r>
@@ -983,6 +1056,7 @@
           <w:color w:val="1A1A1A"/>
           <w:sz w:val="22"/>
           <w:szCs w:val="22"/>
+          <w:lang w:val="es-AR"/>
         </w:rPr>
         <w:t xml:space="preserve"> Tiene autoridad para asignar trabajo dentro del equipo del proyecto, coordinar con las áreas involucradas y con proveedores, y validar entregables intermedios. Puede aprobar cambios que </w:t>
       </w:r>
@@ -994,6 +1068,7 @@
           <w:color w:val="1A1A1A"/>
           <w:sz w:val="22"/>
           <w:szCs w:val="22"/>
+          <w:lang w:val="es-AR"/>
         </w:rPr>
         <w:t xml:space="preserve">no afecten</w:t>
       </w:r>
@@ -1003,13 +1078,14 @@
           <w:color w:val="1A1A1A"/>
           <w:sz w:val="22"/>
           <w:szCs w:val="22"/>
+          <w:lang w:val="es-AR"/>
         </w:rPr>
         <w:t xml:space="preserve"> el alcance, el costo total ni la fecha de finalización comprometidos en este Acta; todo cambio que afecte alguno de esos tres factores debe elevarse al patrocinador para su aprobación. Tiene autoridad para acceder a las instalaciones de la organización en horario de funcionamiento y, cuando el proyecto lo requiera, fuera de él, coordinando previamente con el Referente de Operaciones.</w:t>
       </w:r>
     </w:p>
     <w:p>
       <w:pPr>
-        <w:spacing w:after="140" w:line="288"/>
+        <w:spacing w:after="120" w:line="280"/>
         <w:jc w:val="both"/>
       </w:pPr>
       <w:r>
@@ -1020,6 +1096,7 @@
           <w:color w:val="1A1A1A"/>
           <w:sz w:val="22"/>
           <w:szCs w:val="22"/>
+          <w:lang w:val="es-AR"/>
         </w:rPr>
         <w:t xml:space="preserve">Arquitecto de Software / Líder Técnico.</w:t>
       </w:r>
@@ -1029,13 +1106,14 @@
           <w:color w:val="1A1A1A"/>
           <w:sz w:val="22"/>
           <w:szCs w:val="22"/>
+          <w:lang w:val="es-AR"/>
         </w:rPr>
         <w:t xml:space="preserve"> Tiene autoridad para definir la arquitectura técnica y aprobar o rechazar diseños de integración. Las decisiones que impliquen modificar los sistemas existentes (SGOT, CRM, NMS) requieren acuerdo previo del área propietaria de cada sistema.</w:t>
       </w:r>
     </w:p>
     <w:p>
       <w:pPr>
-        <w:spacing w:after="140" w:line="288"/>
+        <w:spacing w:after="120" w:line="280"/>
         <w:jc w:val="both"/>
       </w:pPr>
       <w:r>
@@ -1046,6 +1124,7 @@
           <w:color w:val="1A1A1A"/>
           <w:sz w:val="22"/>
           <w:szCs w:val="22"/>
+          <w:lang w:val="es-AR"/>
         </w:rPr>
         <w:t xml:space="preserve">Analista Funcional.</w:t>
       </w:r>
@@ -1055,13 +1134,14 @@
           <w:color w:val="1A1A1A"/>
           <w:sz w:val="22"/>
           <w:szCs w:val="22"/>
+          <w:lang w:val="es-AR"/>
         </w:rPr>
         <w:t xml:space="preserve"> Tiene autoridad para convocar a usuarios clave de Operaciones, NOC y Logística a instancias de relevamiento y validación, dentro de la disponibilidad acordada con cada área.</w:t>
       </w:r>
     </w:p>
     <w:p>
       <w:pPr>
-        <w:spacing w:after="140" w:line="288"/>
+        <w:spacing w:after="120" w:line="280"/>
         <w:jc w:val="both"/>
       </w:pPr>
       <w:r>
@@ -1072,6 +1152,7 @@
           <w:color w:val="1A1A1A"/>
           <w:sz w:val="22"/>
           <w:szCs w:val="22"/>
+          <w:lang w:val="es-AR"/>
         </w:rPr>
         <w:t xml:space="preserve">Responsable de Seguridad de la Información.</w:t>
       </w:r>
@@ -1081,6 +1162,7 @@
           <w:color w:val="1A1A1A"/>
           <w:sz w:val="22"/>
           <w:szCs w:val="22"/>
+          <w:lang w:val="es-AR"/>
         </w:rPr>
         <w:t xml:space="preserve"> Tiene autoridad para </w:t>
       </w:r>
@@ -1092,6 +1174,7 @@
           <w:color w:val="1A1A1A"/>
           <w:sz w:val="22"/>
           <w:szCs w:val="22"/>
+          <w:lang w:val="es-AR"/>
         </w:rPr>
         <w:t xml:space="preserve">bloquear la puesta en producción</w:t>
       </w:r>
@@ -1101,13 +1184,14 @@
           <w:color w:val="1A1A1A"/>
           <w:sz w:val="22"/>
           <w:szCs w:val="22"/>
+          <w:lang w:val="es-AR"/>
         </w:rPr>
         <w:t xml:space="preserve"> de cualquier componente que no cumpla las políticas de seguridad de la organización o la normativa de protección de datos personales. Esta decisión solo puede ser revertida por la Gerencia de Tecnología y Sistemas.</w:t>
       </w:r>
     </w:p>
     <w:p>
       <w:pPr>
-        <w:spacing w:after="140" w:line="288"/>
+        <w:spacing w:after="120" w:line="280"/>
         <w:jc w:val="both"/>
       </w:pPr>
       <w:r>
@@ -1118,6 +1202,7 @@
           <w:color w:val="1A1A1A"/>
           <w:sz w:val="22"/>
           <w:szCs w:val="22"/>
+          <w:lang w:val="es-AR"/>
         </w:rPr>
         <w:t xml:space="preserve">Referente de Operaciones.</w:t>
       </w:r>
@@ -1127,13 +1212,14 @@
           <w:color w:val="1A1A1A"/>
           <w:sz w:val="22"/>
           <w:szCs w:val="22"/>
+          <w:lang w:val="es-AR"/>
         </w:rPr>
         <w:t xml:space="preserve"> Tiene autoridad para autorizar el ingreso del equipo del proyecto a las zonas operativas y para definir, junto con Supervisión de Instalaciones, la zona y el momento del piloto.</w:t>
       </w:r>
     </w:p>
     <w:p>
       <w:pPr>
-        <w:spacing w:after="140" w:line="288"/>
+        <w:spacing w:after="120" w:line="280"/>
         <w:jc w:val="both"/>
       </w:pPr>
       <w:r>
@@ -1144,6 +1230,7 @@
           <w:color w:val="B00020"/>
           <w:sz w:val="22"/>
           <w:szCs w:val="22"/>
+          <w:lang w:val="es-AR"/>
         </w:rPr>
         <w:t xml:space="preserve">⚠ </w:t>
       </w:r>
@@ -1155,6 +1242,7 @@
           <w:color w:val="B00020"/>
           <w:sz w:val="22"/>
           <w:szCs w:val="22"/>
+          <w:lang w:val="es-AR"/>
         </w:rPr>
         <w:t xml:space="preserve">Autoridad de compra: el Director de Proyecto puede aprobar adquisiciones hasta el monto fijado por la política de compras vigente de la organización; para excederlo debe solicitar autorización a la Gerencia de Administración y Finanzas.</w:t>
       </w:r>
@@ -1166,6 +1254,7 @@
           <w:color w:val="B00020"/>
           <w:sz w:val="22"/>
           <w:szCs w:val="22"/>
+          <w:lang w:val="es-AR"/>
         </w:rPr>
         <w:t xml:space="preserve"> </w:t>
       </w:r>
@@ -1179,20 +1268,21 @@
           <w:color w:val="B00020"/>
           <w:sz w:val="22"/>
           <w:szCs w:val="22"/>
+          <w:lang w:val="es-AR"/>
         </w:rPr>
         <w:t xml:space="preserve">(Completar con el monto real si el grupo lo define. Este es el campo donde el ejemplo de cátedra es más concreto — conviene no dejarlo genérico.)</w:t>
       </w:r>
     </w:p>
     <w:p>
       <w:pPr>
-        <w:spacing w:after="260" w:before="0"/>
+        <w:spacing w:after="160" w:before="0"/>
       </w:pPr>
     </w:p>
     <w:p>
       <w:pPr>
         <w:pStyle w:val="Heading1"/>
         <w:keepNext/>
-        <w:spacing w:after="260" w:before="560"/>
+        <w:spacing w:after="220" w:before="380"/>
         <w:jc w:val="center"/>
       </w:pPr>
       <w:r>
@@ -1204,6 +1294,7 @@
           <w:spacing w:val="30"/>
           <w:sz w:val="25"/>
           <w:szCs w:val="25"/>
+          <w:lang w:val="es-AR"/>
         </w:rPr>
         <w:t xml:space="preserve">ALCANCE DEL PROYECTO</w:t>
       </w:r>
@@ -1212,7 +1303,7 @@
       <w:pPr>
         <w:pStyle w:val="Heading2"/>
         <w:keepNext/>
-        <w:spacing w:after="140" w:before="400"/>
+        <w:spacing w:after="120" w:before="300"/>
       </w:pPr>
       <w:r>
         <w:rPr>
@@ -1223,21 +1314,23 @@
           <w:spacing w:val="18"/>
           <w:sz w:val="21"/>
           <w:szCs w:val="21"/>
+          <w:lang w:val="es-AR"/>
         </w:rPr>
         <w:t xml:space="preserve">JUSTIFICACIÓN</w:t>
       </w:r>
     </w:p>
     <w:p>
       <w:pPr>
-        <w:spacing w:after="140" w:line="288"/>
-        <w:jc w:val="both"/>
-      </w:pPr>
-      <w:r>
-        <w:rPr>
-          <w:rFonts w:ascii="Arial" w:cs="Arial" w:eastAsia="Arial" w:hAnsi="Arial"/>
-          <w:color w:val="1A1A1A"/>
-          <w:sz w:val="22"/>
-          <w:szCs w:val="22"/>
+        <w:spacing w:after="120" w:line="280"/>
+        <w:jc w:val="both"/>
+      </w:pPr>
+      <w:r>
+        <w:rPr>
+          <w:rFonts w:ascii="Arial" w:cs="Arial" w:eastAsia="Arial" w:hAnsi="Arial"/>
+          <w:color w:val="1A1A1A"/>
+          <w:sz w:val="22"/>
+          <w:szCs w:val="22"/>
+          <w:lang w:val="es-AR"/>
         </w:rPr>
         <w:t xml:space="preserve">El proceso de instalación de internet con fibra óptica, relevado y modelado en la Etapa 1 de este trabajo, presenta tres debilidades que fueron identificadas y documentadas en las etapas anteriores y que hoy no tienen tratamiento:</w:t>
       </w:r>
@@ -1260,6 +1353,7 @@
           <w:color w:val="1A1A1A"/>
           <w:sz w:val="22"/>
           <w:szCs w:val="22"/>
+          <w:lang w:val="es-AR"/>
         </w:rPr>
         <w:t xml:space="preserve">Falta de trazabilidad de la orden de trabajo.</w:t>
       </w:r>
@@ -1269,6 +1363,7 @@
           <w:color w:val="1A1A1A"/>
           <w:sz w:val="22"/>
           <w:szCs w:val="22"/>
+          <w:lang w:val="es-AR"/>
         </w:rPr>
         <w:t xml:space="preserve"> El estado real de la instalación no está disponible en tiempo real para las áreas que lo necesitan, lo que genera reclamos duplicados y consultas manuales entre Operaciones, NOC y el área Comercial.</w:t>
       </w:r>
@@ -1291,6 +1386,7 @@
           <w:color w:val="1A1A1A"/>
           <w:sz w:val="22"/>
           <w:szCs w:val="22"/>
+          <w:lang w:val="es-AR"/>
         </w:rPr>
         <w:t xml:space="preserve">Ausencia de criterio de priorización en la cola de órdenes de trabajo.</w:t>
       </w:r>
@@ -1300,6 +1396,7 @@
           <w:color w:val="1A1A1A"/>
           <w:sz w:val="22"/>
           <w:szCs w:val="22"/>
+          <w:lang w:val="es-AR"/>
         </w:rPr>
         <w:t xml:space="preserve"> Identificado en la Etapa 2 como riesgo </w:t>
       </w:r>
@@ -1311,6 +1408,7 @@
           <w:color w:val="1A1A1A"/>
           <w:sz w:val="22"/>
           <w:szCs w:val="22"/>
+          <w:lang w:val="es-AR"/>
         </w:rPr>
         <w:t xml:space="preserve">R07</w:t>
       </w:r>
@@ -1320,6 +1418,7 @@
           <w:color w:val="1A1A1A"/>
           <w:sz w:val="22"/>
           <w:szCs w:val="22"/>
+          <w:lang w:val="es-AR"/>
         </w:rPr>
         <w:t xml:space="preserve">, valorado en severidad 12 y </w:t>
       </w:r>
@@ -1331,6 +1430,7 @@
           <w:color w:val="1A1A1A"/>
           <w:sz w:val="22"/>
           <w:szCs w:val="22"/>
+          <w:lang w:val="es-AR"/>
         </w:rPr>
         <w:t xml:space="preserve">sin plan de tratamiento</w:t>
       </w:r>
@@ -1340,6 +1440,7 @@
           <w:color w:val="1A1A1A"/>
           <w:sz w:val="22"/>
           <w:szCs w:val="22"/>
+          <w:lang w:val="es-AR"/>
         </w:rPr>
         <w:t xml:space="preserve">.</w:t>
       </w:r>
@@ -1362,6 +1463,7 @@
           <w:color w:val="1A1A1A"/>
           <w:sz w:val="22"/>
           <w:szCs w:val="22"/>
+          <w:lang w:val="es-AR"/>
         </w:rPr>
         <w:t xml:space="preserve">Falta de control de competencias técnicas al asignar una orden.</w:t>
       </w:r>
@@ -1371,6 +1473,7 @@
           <w:color w:val="1A1A1A"/>
           <w:sz w:val="22"/>
           <w:szCs w:val="22"/>
+          <w:lang w:val="es-AR"/>
         </w:rPr>
         <w:t xml:space="preserve"> Identificado en la Etapa 2 como riesgo </w:t>
       </w:r>
@@ -1382,6 +1485,7 @@
           <w:color w:val="1A1A1A"/>
           <w:sz w:val="22"/>
           <w:szCs w:val="22"/>
+          <w:lang w:val="es-AR"/>
         </w:rPr>
         <w:t xml:space="preserve">R04</w:t>
       </w:r>
@@ -1391,6 +1495,7 @@
           <w:color w:val="1A1A1A"/>
           <w:sz w:val="22"/>
           <w:szCs w:val="22"/>
+          <w:lang w:val="es-AR"/>
         </w:rPr>
         <w:t xml:space="preserve"> — técnico sin capacitación en el nuevo modelo de ONT —, valorado en severidad 12 y </w:t>
       </w:r>
@@ -1402,6 +1507,7 @@
           <w:color w:val="1A1A1A"/>
           <w:sz w:val="22"/>
           <w:szCs w:val="22"/>
+          <w:lang w:val="es-AR"/>
         </w:rPr>
         <w:t xml:space="preserve">también sin plan de tratamiento</w:t>
       </w:r>
@@ -1411,36 +1517,39 @@
           <w:color w:val="1A1A1A"/>
           <w:sz w:val="22"/>
           <w:szCs w:val="22"/>
+          <w:lang w:val="es-AR"/>
         </w:rPr>
         <w:t xml:space="preserve">.</w:t>
       </w:r>
     </w:p>
     <w:p>
       <w:pPr>
-        <w:spacing w:after="140" w:line="288"/>
-        <w:jc w:val="both"/>
-      </w:pPr>
-      <w:r>
-        <w:rPr>
-          <w:rFonts w:ascii="Arial" w:cs="Arial" w:eastAsia="Arial" w:hAnsi="Arial"/>
-          <w:color w:val="1A1A1A"/>
-          <w:sz w:val="22"/>
-          <w:szCs w:val="22"/>
+        <w:spacing w:after="120" w:line="280"/>
+        <w:jc w:val="both"/>
+      </w:pPr>
+      <w:r>
+        <w:rPr>
+          <w:rFonts w:ascii="Arial" w:cs="Arial" w:eastAsia="Arial" w:hAnsi="Arial"/>
+          <w:color w:val="1A1A1A"/>
+          <w:sz w:val="22"/>
+          <w:szCs w:val="22"/>
+          <w:lang w:val="es-AR"/>
         </w:rPr>
         <w:t xml:space="preserve">Este proyecto constituye el tratamiento de los riesgos R04 y R07, cubriendo un hueco de la etapa anterior, y contribuye adicionalmente a la mitigación de R06 (ausencia de flujo de escalamiento en el CRM) al eliminar aguas arriba la causa de los reclamos duplicados, y de R05 (credenciales de contratistas sin baja), dado que la aplicación de campo es el control ya comprometido en la Etapa 2 para que los técnicos contratistas operen sin acceso a los sistemas de backend.</w:t>
       </w:r>
     </w:p>
     <w:p>
       <w:pPr>
-        <w:spacing w:after="140" w:line="288"/>
-        <w:jc w:val="both"/>
-      </w:pPr>
-      <w:r>
-        <w:rPr>
-          <w:rFonts w:ascii="Arial" w:cs="Arial" w:eastAsia="Arial" w:hAnsi="Arial"/>
-          <w:color w:val="1A1A1A"/>
-          <w:sz w:val="22"/>
-          <w:szCs w:val="22"/>
+        <w:spacing w:after="120" w:line="280"/>
+        <w:jc w:val="both"/>
+      </w:pPr>
+      <w:r>
+        <w:rPr>
+          <w:rFonts w:ascii="Arial" w:cs="Arial" w:eastAsia="Arial" w:hAnsi="Arial"/>
+          <w:color w:val="1A1A1A"/>
+          <w:sz w:val="22"/>
+          <w:szCs w:val="22"/>
+          <w:lang w:val="es-AR"/>
         </w:rPr>
         <w:t xml:space="preserve">Asimismo, el proyecto da cumplimiento al </w:t>
       </w:r>
@@ -1452,6 +1561,7 @@
           <w:color w:val="1A1A1A"/>
           <w:sz w:val="22"/>
           <w:szCs w:val="22"/>
+          <w:lang w:val="es-AR"/>
         </w:rPr>
         <w:t xml:space="preserve">objetivo de TI ya definido por la organización en la Etapa 1</w:t>
       </w:r>
@@ -1461,6 +1571,7 @@
           <w:color w:val="1A1A1A"/>
           <w:sz w:val="22"/>
           <w:szCs w:val="22"/>
+          <w:lang w:val="es-AR"/>
         </w:rPr>
         <w:t xml:space="preserve"> — </w:t>
       </w:r>
@@ -1472,6 +1583,7 @@
           <w:color w:val="1A1A1A"/>
           <w:sz w:val="22"/>
           <w:szCs w:val="22"/>
+          <w:lang w:val="es-AR"/>
         </w:rPr>
         <w:t xml:space="preserve">implementar una aplicación de gestión para técnicos de campo que permita aumentar la productividad operativa en un 5%</w:t>
       </w:r>
@@ -1481,6 +1593,7 @@
           <w:color w:val="1A1A1A"/>
           <w:sz w:val="22"/>
           <w:szCs w:val="22"/>
+          <w:lang w:val="es-AR"/>
         </w:rPr>
         <w:t xml:space="preserve"> — y a la meta de TI </w:t>
       </w:r>
@@ -1492,6 +1605,7 @@
           <w:color w:val="1A1A1A"/>
           <w:sz w:val="22"/>
           <w:szCs w:val="22"/>
+          <w:lang w:val="es-AR"/>
         </w:rPr>
         <w:t xml:space="preserve">Asignación Optimizada de Técnicos</w:t>
       </w:r>
@@ -1501,6 +1615,7 @@
           <w:color w:val="1A1A1A"/>
           <w:sz w:val="22"/>
           <w:szCs w:val="22"/>
+          <w:lang w:val="es-AR"/>
         </w:rPr>
         <w:t xml:space="preserve">, ambos alineados con el objetivo de negocio de </w:t>
       </w:r>
@@ -1512,6 +1627,7 @@
           <w:color w:val="1A1A1A"/>
           <w:sz w:val="22"/>
           <w:szCs w:val="22"/>
+          <w:lang w:val="es-AR"/>
         </w:rPr>
         <w:t xml:space="preserve">aumentar el rendimiento de los técnicos en un 5%, medido como instalaciones sobre horas de trabajo</w:t>
       </w:r>
@@ -1521,6 +1637,7 @@
           <w:color w:val="1A1A1A"/>
           <w:sz w:val="22"/>
           <w:szCs w:val="22"/>
+          <w:lang w:val="es-AR"/>
         </w:rPr>
         <w:t xml:space="preserve">.</w:t>
       </w:r>
@@ -1529,7 +1646,7 @@
       <w:pPr>
         <w:pStyle w:val="Heading2"/>
         <w:keepNext/>
-        <w:spacing w:after="140" w:before="400"/>
+        <w:spacing w:after="120" w:before="300"/>
       </w:pPr>
       <w:r>
         <w:rPr>
@@ -1540,13 +1657,14 @@
           <w:spacing w:val="18"/>
           <w:sz w:val="21"/>
           <w:szCs w:val="21"/>
+          <w:lang w:val="es-AR"/>
         </w:rPr>
         <w:t xml:space="preserve">PRODUCTO</w:t>
       </w:r>
     </w:p>
     <w:p>
       <w:pPr>
-        <w:spacing w:after="140" w:line="288"/>
+        <w:spacing w:after="120" w:line="280"/>
         <w:jc w:val="both"/>
       </w:pPr>
       <w:r>
@@ -1557,6 +1675,7 @@
           <w:color w:val="1A1A1A"/>
           <w:sz w:val="22"/>
           <w:szCs w:val="22"/>
+          <w:lang w:val="es-AR"/>
         </w:rPr>
         <w:t xml:space="preserve">Plataforma de Gestión de Órdenes de Trabajo de Campo (OT-Campo)</w:t>
       </w:r>
@@ -1566,21 +1685,23 @@
           <w:color w:val="1A1A1A"/>
           <w:sz w:val="22"/>
           <w:szCs w:val="22"/>
+          <w:lang w:val="es-AR"/>
         </w:rPr>
         <w:t xml:space="preserve">: solución de desarrollo interno, en producción e integrada con los sistemas existentes, que gestiona el ciclo completo de la orden de trabajo de instalación de fibra óptica, desde el despacho hasta el cierre con conformidad del cliente.</w:t>
       </w:r>
     </w:p>
     <w:p>
       <w:pPr>
-        <w:spacing w:after="140" w:line="288"/>
-        <w:jc w:val="both"/>
-      </w:pPr>
-      <w:r>
-        <w:rPr>
-          <w:rFonts w:ascii="Arial" w:cs="Arial" w:eastAsia="Arial" w:hAnsi="Arial"/>
-          <w:color w:val="1A1A1A"/>
-          <w:sz w:val="22"/>
-          <w:szCs w:val="22"/>
+        <w:spacing w:after="120" w:line="280"/>
+        <w:jc w:val="both"/>
+      </w:pPr>
+      <w:r>
+        <w:rPr>
+          <w:rFonts w:ascii="Arial" w:cs="Arial" w:eastAsia="Arial" w:hAnsi="Arial"/>
+          <w:color w:val="1A1A1A"/>
+          <w:sz w:val="22"/>
+          <w:szCs w:val="22"/>
+          <w:lang w:val="es-AR"/>
         </w:rPr>
         <w:t xml:space="preserve">Comprende seis componentes:</w:t>
       </w:r>
@@ -1590,7 +1711,7 @@
         <w:pStyle w:val="ListParagraph"/>
         <w:numPr>
           <w:ilvl w:val="0"/>
-          <w:numId w:val="2"/>
+          <w:numId w:val="3"/>
         </w:numPr>
         <w:spacing w:after="100" w:line="276"/>
         <w:jc w:val="both"/>
@@ -1601,6 +1722,7 @@
           <w:color w:val="1A1A1A"/>
           <w:sz w:val="22"/>
           <w:szCs w:val="22"/>
+          <w:lang w:val="es-AR"/>
         </w:rPr>
         <w:t xml:space="preserve">Módulo de despacho y priorización, con cola única alimentada por CRM, SGOT y excepciones del NMS, cronómetro de SLA y escalamiento.</w:t>
       </w:r>
@@ -1610,7 +1732,7 @@
         <w:pStyle w:val="ListParagraph"/>
         <w:numPr>
           <w:ilvl w:val="0"/>
-          <w:numId w:val="2"/>
+          <w:numId w:val="3"/>
         </w:numPr>
         <w:spacing w:after="100" w:line="276"/>
         <w:jc w:val="both"/>
@@ -1621,6 +1743,7 @@
           <w:color w:val="1A1A1A"/>
           <w:sz w:val="22"/>
           <w:szCs w:val="22"/>
+          <w:lang w:val="es-AR"/>
         </w:rPr>
         <w:t xml:space="preserve">Motor de asignación por competencia certificada, zona o nodo, carga del día, ventana horaria y stock del vehículo.</w:t>
       </w:r>
@@ -1630,7 +1753,7 @@
         <w:pStyle w:val="ListParagraph"/>
         <w:numPr>
           <w:ilvl w:val="0"/>
-          <w:numId w:val="2"/>
+          <w:numId w:val="3"/>
         </w:numPr>
         <w:spacing w:after="100" w:line="276"/>
         <w:jc w:val="both"/>
@@ -1641,6 +1764,7 @@
           <w:color w:val="1A1A1A"/>
           <w:sz w:val="22"/>
           <w:szCs w:val="22"/>
+          <w:lang w:val="es-AR"/>
         </w:rPr>
         <w:t xml:space="preserve">Aplicación móvil de campo </w:t>
       </w:r>
@@ -1652,6 +1776,7 @@
           <w:color w:val="1A1A1A"/>
           <w:sz w:val="22"/>
           <w:szCs w:val="22"/>
+          <w:lang w:val="es-AR"/>
         </w:rPr>
         <w:t xml:space="preserve">offline-first</w:t>
       </w:r>
@@ -1661,6 +1786,7 @@
           <w:color w:val="1A1A1A"/>
           <w:sz w:val="22"/>
           <w:szCs w:val="22"/>
+          <w:lang w:val="es-AR"/>
         </w:rPr>
         <w:t xml:space="preserve">, con agenda, ficha de orden de trabajo, checklist por modelo de ONT, registro de mediciones ópticas, evidencia fotográfica, geolocalización, consumo de materiales, tipificación obligatoria del motivo cuando la visita no se completa y conformidad del cliente con firma digital.</w:t>
       </w:r>
@@ -1670,7 +1796,7 @@
         <w:pStyle w:val="ListParagraph"/>
         <w:numPr>
           <w:ilvl w:val="0"/>
-          <w:numId w:val="2"/>
+          <w:numId w:val="3"/>
         </w:numPr>
         <w:spacing w:after="100" w:line="276"/>
         <w:jc w:val="both"/>
@@ -1681,6 +1807,7 @@
           <w:color w:val="1A1A1A"/>
           <w:sz w:val="22"/>
           <w:szCs w:val="22"/>
+          <w:lang w:val="es-AR"/>
         </w:rPr>
         <w:t xml:space="preserve">Integraciones con SGOT, CRM, base de datos de clientes y órdenes de trabajo, NMS y sistema de stock.</w:t>
       </w:r>
@@ -1690,7 +1817,7 @@
         <w:pStyle w:val="ListParagraph"/>
         <w:numPr>
           <w:ilvl w:val="0"/>
-          <w:numId w:val="2"/>
+          <w:numId w:val="3"/>
         </w:numPr>
         <w:spacing w:after="100" w:line="276"/>
         <w:jc w:val="both"/>
@@ -1701,6 +1828,7 @@
           <w:color w:val="1A1A1A"/>
           <w:sz w:val="22"/>
           <w:szCs w:val="22"/>
+          <w:lang w:val="es-AR"/>
         </w:rPr>
         <w:t xml:space="preserve">Capa de seguridad: inicio de sesión único con doble factor, mínimo privilegio, baja automática de credenciales integrada con Recursos Humanos y registro de auditoría.</w:t>
       </w:r>
@@ -1710,7 +1838,7 @@
         <w:pStyle w:val="ListParagraph"/>
         <w:numPr>
           <w:ilvl w:val="0"/>
-          <w:numId w:val="2"/>
+          <w:numId w:val="3"/>
         </w:numPr>
         <w:spacing w:after="100" w:line="276"/>
         <w:jc w:val="both"/>
@@ -1721,13 +1849,14 @@
           <w:color w:val="1A1A1A"/>
           <w:sz w:val="22"/>
           <w:szCs w:val="22"/>
+          <w:lang w:val="es-AR"/>
         </w:rPr>
         <w:t xml:space="preserve">Tablero de indicadores para Supervisión y Gerencia de Operaciones.</w:t>
       </w:r>
     </w:p>
     <w:p>
       <w:pPr>
-        <w:spacing w:after="140" w:line="288"/>
+        <w:spacing w:after="120" w:line="280"/>
         <w:jc w:val="both"/>
       </w:pPr>
       <w:r>
@@ -1738,6 +1867,7 @@
           <w:color w:val="B00020"/>
           <w:sz w:val="22"/>
           <w:szCs w:val="22"/>
+          <w:lang w:val="es-AR"/>
         </w:rPr>
         <w:t xml:space="preserve">⚠ </w:t>
       </w:r>
@@ -1749,6 +1879,7 @@
           <w:color w:val="B00020"/>
           <w:sz w:val="22"/>
           <w:szCs w:val="22"/>
+          <w:lang w:val="es-AR"/>
         </w:rPr>
         <w:t xml:space="preserve">Si el docente objeta el desarrollo interno, este apartado cambia a "solución de mercado configurada e integrada" y el componente 3 pasa a ser configuración de la aplicación del proveedor.</w:t>
       </w:r>
@@ -1757,7 +1888,7 @@
       <w:pPr>
         <w:pStyle w:val="Heading2"/>
         <w:keepNext/>
-        <w:spacing w:after="140" w:before="400"/>
+        <w:spacing w:after="120" w:before="300"/>
       </w:pPr>
       <w:r>
         <w:rPr>
@@ -1768,21 +1899,23 @@
           <w:spacing w:val="18"/>
           <w:sz w:val="21"/>
           <w:szCs w:val="21"/>
+          <w:lang w:val="es-AR"/>
         </w:rPr>
         <w:t xml:space="preserve">ENTREGABLES</w:t>
       </w:r>
     </w:p>
     <w:p>
       <w:pPr>
-        <w:spacing w:after="140" w:line="288"/>
-        <w:jc w:val="both"/>
-      </w:pPr>
-      <w:r>
-        <w:rPr>
-          <w:rFonts w:ascii="Arial" w:cs="Arial" w:eastAsia="Arial" w:hAnsi="Arial"/>
-          <w:color w:val="1A1A1A"/>
-          <w:sz w:val="22"/>
-          <w:szCs w:val="22"/>
+        <w:spacing w:after="120" w:line="280"/>
+        <w:jc w:val="both"/>
+      </w:pPr>
+      <w:r>
+        <w:rPr>
+          <w:rFonts w:ascii="Arial" w:cs="Arial" w:eastAsia="Arial" w:hAnsi="Arial"/>
+          <w:color w:val="1A1A1A"/>
+          <w:sz w:val="22"/>
+          <w:szCs w:val="22"/>
+          <w:lang w:val="es-AR"/>
         </w:rPr>
         <w:t xml:space="preserve">Primera aproximación de la Estructura de Desglose de Trabajo, con los entregables principales por fase:</w:t>
       </w:r>
@@ -1823,6 +1956,8 @@
           </w:tcPr>
           <w:p>
             <w:pPr>
+              <w:keepNext w:val="false"/>
+              <w:suppressAutoHyphens/>
               <w:spacing w:after="0" w:before="0" w:line="252"/>
               <w:jc w:val="left"/>
             </w:pPr>
@@ -1834,6 +1969,7 @@
                 <w:color w:val="1A1A1A"/>
                 <w:sz w:val="18"/>
                 <w:szCs w:val="18"/>
+                <w:lang w:val="es-AR"/>
               </w:rPr>
               <w:t xml:space="preserve">Fase</w:t>
             </w:r>
@@ -1853,6 +1989,8 @@
           </w:tcPr>
           <w:p>
             <w:pPr>
+              <w:keepNext w:val="false"/>
+              <w:suppressAutoHyphens/>
               <w:spacing w:after="0" w:before="0" w:line="252"/>
               <w:jc w:val="left"/>
             </w:pPr>
@@ -1864,6 +2002,7 @@
                 <w:color w:val="1A1A1A"/>
                 <w:sz w:val="18"/>
                 <w:szCs w:val="18"/>
+                <w:lang w:val="es-AR"/>
               </w:rPr>
               <w:t xml:space="preserve">Entregable principal</w:t>
             </w:r>
@@ -1888,15 +2027,18 @@
           </w:tcPr>
           <w:p>
             <w:pPr>
-              <w:spacing w:after="0" w:before="0" w:line="252"/>
-              <w:jc w:val="both"/>
-            </w:pPr>
-            <w:r>
-              <w:rPr>
-                <w:rFonts w:ascii="Arial" w:cs="Arial" w:eastAsia="Arial" w:hAnsi="Arial"/>
-                <w:color w:val="1A1A1A"/>
-                <w:sz w:val="18"/>
-                <w:szCs w:val="18"/>
+              <w:keepNext w:val="false"/>
+              <w:suppressAutoHyphens/>
+              <w:spacing w:after="0" w:before="0" w:line="252"/>
+              <w:jc w:val="left"/>
+            </w:pPr>
+            <w:r>
+              <w:rPr>
+                <w:rFonts w:ascii="Arial" w:cs="Arial" w:eastAsia="Arial" w:hAnsi="Arial"/>
+                <w:color w:val="1A1A1A"/>
+                <w:sz w:val="18"/>
+                <w:szCs w:val="18"/>
+                <w:lang w:val="es-AR"/>
               </w:rPr>
               <w:t xml:space="preserve">1. Inicio</w:t>
             </w:r>
@@ -1915,15 +2057,18 @@
           </w:tcPr>
           <w:p>
             <w:pPr>
-              <w:spacing w:after="0" w:before="0" w:line="252"/>
-              <w:jc w:val="both"/>
-            </w:pPr>
-            <w:r>
-              <w:rPr>
-                <w:rFonts w:ascii="Arial" w:cs="Arial" w:eastAsia="Arial" w:hAnsi="Arial"/>
-                <w:color w:val="1A1A1A"/>
-                <w:sz w:val="18"/>
-                <w:szCs w:val="18"/>
+              <w:keepNext w:val="false"/>
+              <w:suppressAutoHyphens/>
+              <w:spacing w:after="0" w:before="0" w:line="252"/>
+              <w:jc w:val="left"/>
+            </w:pPr>
+            <w:r>
+              <w:rPr>
+                <w:rFonts w:ascii="Arial" w:cs="Arial" w:eastAsia="Arial" w:hAnsi="Arial"/>
+                <w:color w:val="1A1A1A"/>
+                <w:sz w:val="18"/>
+                <w:szCs w:val="18"/>
+                <w:lang w:val="es-AR"/>
               </w:rPr>
               <w:t xml:space="preserve">Acta de Proyecto aprobada</w:t>
             </w:r>
@@ -1948,15 +2093,18 @@
           </w:tcPr>
           <w:p>
             <w:pPr>
-              <w:spacing w:after="0" w:before="0" w:line="252"/>
-              <w:jc w:val="both"/>
-            </w:pPr>
-            <w:r>
-              <w:rPr>
-                <w:rFonts w:ascii="Arial" w:cs="Arial" w:eastAsia="Arial" w:hAnsi="Arial"/>
-                <w:color w:val="1A1A1A"/>
-                <w:sz w:val="18"/>
-                <w:szCs w:val="18"/>
+              <w:keepNext w:val="false"/>
+              <w:suppressAutoHyphens/>
+              <w:spacing w:after="0" w:before="0" w:line="252"/>
+              <w:jc w:val="left"/>
+            </w:pPr>
+            <w:r>
+              <w:rPr>
+                <w:rFonts w:ascii="Arial" w:cs="Arial" w:eastAsia="Arial" w:hAnsi="Arial"/>
+                <w:color w:val="1A1A1A"/>
+                <w:sz w:val="18"/>
+                <w:szCs w:val="18"/>
+                <w:lang w:val="es-AR"/>
               </w:rPr>
               <w:t xml:space="preserve">2. Relevamiento y análisis</w:t>
             </w:r>
@@ -1975,15 +2123,18 @@
           </w:tcPr>
           <w:p>
             <w:pPr>
-              <w:spacing w:after="0" w:before="0" w:line="252"/>
-              <w:jc w:val="both"/>
-            </w:pPr>
-            <w:r>
-              <w:rPr>
-                <w:rFonts w:ascii="Arial" w:cs="Arial" w:eastAsia="Arial" w:hAnsi="Arial"/>
-                <w:color w:val="1A1A1A"/>
-                <w:sz w:val="18"/>
-                <w:szCs w:val="18"/>
+              <w:keepNext w:val="false"/>
+              <w:suppressAutoHyphens/>
+              <w:spacing w:after="0" w:before="0" w:line="252"/>
+              <w:jc w:val="left"/>
+            </w:pPr>
+            <w:r>
+              <w:rPr>
+                <w:rFonts w:ascii="Arial" w:cs="Arial" w:eastAsia="Arial" w:hAnsi="Arial"/>
+                <w:color w:val="1A1A1A"/>
+                <w:sz w:val="18"/>
+                <w:szCs w:val="18"/>
+                <w:lang w:val="es-AR"/>
               </w:rPr>
               <w:t xml:space="preserve">Documento de requerimientos validado y </w:t>
             </w:r>
@@ -1995,6 +2146,7 @@
                 <w:color w:val="1A1A1A"/>
                 <w:sz w:val="18"/>
                 <w:szCs w:val="18"/>
+                <w:lang w:val="es-AR"/>
               </w:rPr>
               <w:t xml:space="preserve">medición de las líneas base</w:t>
             </w:r>
@@ -2004,6 +2156,7 @@
                 <w:color w:val="1A1A1A"/>
                 <w:sz w:val="18"/>
                 <w:szCs w:val="18"/>
+                <w:lang w:val="es-AR"/>
               </w:rPr>
               <w:t xml:space="preserve"> de los indicadores</w:t>
             </w:r>
@@ -2028,15 +2181,18 @@
           </w:tcPr>
           <w:p>
             <w:pPr>
-              <w:spacing w:after="0" w:before="0" w:line="252"/>
-              <w:jc w:val="both"/>
-            </w:pPr>
-            <w:r>
-              <w:rPr>
-                <w:rFonts w:ascii="Arial" w:cs="Arial" w:eastAsia="Arial" w:hAnsi="Arial"/>
-                <w:color w:val="1A1A1A"/>
-                <w:sz w:val="18"/>
-                <w:szCs w:val="18"/>
+              <w:keepNext w:val="false"/>
+              <w:suppressAutoHyphens/>
+              <w:spacing w:after="0" w:before="0" w:line="252"/>
+              <w:jc w:val="left"/>
+            </w:pPr>
+            <w:r>
+              <w:rPr>
+                <w:rFonts w:ascii="Arial" w:cs="Arial" w:eastAsia="Arial" w:hAnsi="Arial"/>
+                <w:color w:val="1A1A1A"/>
+                <w:sz w:val="18"/>
+                <w:szCs w:val="18"/>
+                <w:lang w:val="es-AR"/>
               </w:rPr>
               <w:t xml:space="preserve">3. Arquitectura y diseño técnico</w:t>
             </w:r>
@@ -2055,15 +2211,18 @@
           </w:tcPr>
           <w:p>
             <w:pPr>
-              <w:spacing w:after="0" w:before="0" w:line="252"/>
-              <w:jc w:val="both"/>
-            </w:pPr>
-            <w:r>
-              <w:rPr>
-                <w:rFonts w:ascii="Arial" w:cs="Arial" w:eastAsia="Arial" w:hAnsi="Arial"/>
-                <w:color w:val="1A1A1A"/>
-                <w:sz w:val="18"/>
-                <w:szCs w:val="18"/>
+              <w:keepNext w:val="false"/>
+              <w:suppressAutoHyphens/>
+              <w:spacing w:after="0" w:before="0" w:line="252"/>
+              <w:jc w:val="left"/>
+            </w:pPr>
+            <w:r>
+              <w:rPr>
+                <w:rFonts w:ascii="Arial" w:cs="Arial" w:eastAsia="Arial" w:hAnsi="Arial"/>
+                <w:color w:val="1A1A1A"/>
+                <w:sz w:val="18"/>
+                <w:szCs w:val="18"/>
+                <w:lang w:val="es-AR"/>
               </w:rPr>
               <w:t xml:space="preserve">Documento de arquitectura y diseño de integraciones aprobado</w:t>
             </w:r>
@@ -2088,15 +2247,18 @@
           </w:tcPr>
           <w:p>
             <w:pPr>
-              <w:spacing w:after="0" w:before="0" w:line="252"/>
-              <w:jc w:val="both"/>
-            </w:pPr>
-            <w:r>
-              <w:rPr>
-                <w:rFonts w:ascii="Arial" w:cs="Arial" w:eastAsia="Arial" w:hAnsi="Arial"/>
-                <w:color w:val="1A1A1A"/>
-                <w:sz w:val="18"/>
-                <w:szCs w:val="18"/>
+              <w:keepNext w:val="false"/>
+              <w:suppressAutoHyphens/>
+              <w:spacing w:after="0" w:before="0" w:line="252"/>
+              <w:jc w:val="left"/>
+            </w:pPr>
+            <w:r>
+              <w:rPr>
+                <w:rFonts w:ascii="Arial" w:cs="Arial" w:eastAsia="Arial" w:hAnsi="Arial"/>
+                <w:color w:val="1A1A1A"/>
+                <w:sz w:val="18"/>
+                <w:szCs w:val="18"/>
+                <w:lang w:val="es-AR"/>
               </w:rPr>
               <w:t xml:space="preserve">4. Adquisiciones</w:t>
             </w:r>
@@ -2115,15 +2277,18 @@
           </w:tcPr>
           <w:p>
             <w:pPr>
-              <w:spacing w:after="0" w:before="0" w:line="252"/>
-              <w:jc w:val="both"/>
-            </w:pPr>
-            <w:r>
-              <w:rPr>
-                <w:rFonts w:ascii="Arial" w:cs="Arial" w:eastAsia="Arial" w:hAnsi="Arial"/>
-                <w:color w:val="1A1A1A"/>
-                <w:sz w:val="18"/>
-                <w:szCs w:val="18"/>
+              <w:keepNext w:val="false"/>
+              <w:suppressAutoHyphens/>
+              <w:spacing w:after="0" w:before="0" w:line="252"/>
+              <w:jc w:val="left"/>
+            </w:pPr>
+            <w:r>
+              <w:rPr>
+                <w:rFonts w:ascii="Arial" w:cs="Arial" w:eastAsia="Arial" w:hAnsi="Arial"/>
+                <w:color w:val="1A1A1A"/>
+                <w:sz w:val="18"/>
+                <w:szCs w:val="18"/>
+                <w:lang w:val="es-AR"/>
               </w:rPr>
               <w:t xml:space="preserve">Dispositivos, infraestructura y servicios contratados</w:t>
             </w:r>
@@ -2148,15 +2313,18 @@
           </w:tcPr>
           <w:p>
             <w:pPr>
-              <w:spacing w:after="0" w:before="0" w:line="252"/>
-              <w:jc w:val="both"/>
-            </w:pPr>
-            <w:r>
-              <w:rPr>
-                <w:rFonts w:ascii="Arial" w:cs="Arial" w:eastAsia="Arial" w:hAnsi="Arial"/>
-                <w:color w:val="1A1A1A"/>
-                <w:sz w:val="18"/>
-                <w:szCs w:val="18"/>
+              <w:keepNext w:val="false"/>
+              <w:suppressAutoHyphens/>
+              <w:spacing w:after="0" w:before="0" w:line="252"/>
+              <w:jc w:val="left"/>
+            </w:pPr>
+            <w:r>
+              <w:rPr>
+                <w:rFonts w:ascii="Arial" w:cs="Arial" w:eastAsia="Arial" w:hAnsi="Arial"/>
+                <w:color w:val="1A1A1A"/>
+                <w:sz w:val="18"/>
+                <w:szCs w:val="18"/>
+                <w:lang w:val="es-AR"/>
               </w:rPr>
               <w:t xml:space="preserve">5. Desarrollo por módulos</w:t>
             </w:r>
@@ -2175,15 +2343,18 @@
           </w:tcPr>
           <w:p>
             <w:pPr>
-              <w:spacing w:after="0" w:before="0" w:line="252"/>
-              <w:jc w:val="both"/>
-            </w:pPr>
-            <w:r>
-              <w:rPr>
-                <w:rFonts w:ascii="Arial" w:cs="Arial" w:eastAsia="Arial" w:hAnsi="Arial"/>
-                <w:color w:val="1A1A1A"/>
-                <w:sz w:val="18"/>
-                <w:szCs w:val="18"/>
+              <w:keepNext w:val="false"/>
+              <w:suppressAutoHyphens/>
+              <w:spacing w:after="0" w:before="0" w:line="252"/>
+              <w:jc w:val="left"/>
+            </w:pPr>
+            <w:r>
+              <w:rPr>
+                <w:rFonts w:ascii="Arial" w:cs="Arial" w:eastAsia="Arial" w:hAnsi="Arial"/>
+                <w:color w:val="1A1A1A"/>
+                <w:sz w:val="18"/>
+                <w:szCs w:val="18"/>
+                <w:lang w:val="es-AR"/>
               </w:rPr>
               <w:t xml:space="preserve">Módulos de despacho, motor de asignación y aplicación móvil construidos</w:t>
             </w:r>
@@ -2208,15 +2379,18 @@
           </w:tcPr>
           <w:p>
             <w:pPr>
-              <w:spacing w:after="0" w:before="0" w:line="252"/>
-              <w:jc w:val="both"/>
-            </w:pPr>
-            <w:r>
-              <w:rPr>
-                <w:rFonts w:ascii="Arial" w:cs="Arial" w:eastAsia="Arial" w:hAnsi="Arial"/>
-                <w:color w:val="1A1A1A"/>
-                <w:sz w:val="18"/>
-                <w:szCs w:val="18"/>
+              <w:keepNext w:val="false"/>
+              <w:suppressAutoHyphens/>
+              <w:spacing w:after="0" w:before="0" w:line="252"/>
+              <w:jc w:val="left"/>
+            </w:pPr>
+            <w:r>
+              <w:rPr>
+                <w:rFonts w:ascii="Arial" w:cs="Arial" w:eastAsia="Arial" w:hAnsi="Arial"/>
+                <w:color w:val="1A1A1A"/>
+                <w:sz w:val="18"/>
+                <w:szCs w:val="18"/>
+                <w:lang w:val="es-AR"/>
               </w:rPr>
               <w:t xml:space="preserve">6. Integración y seguridad</w:t>
             </w:r>
@@ -2235,15 +2409,18 @@
           </w:tcPr>
           <w:p>
             <w:pPr>
-              <w:spacing w:after="0" w:before="0" w:line="252"/>
-              <w:jc w:val="both"/>
-            </w:pPr>
-            <w:r>
-              <w:rPr>
-                <w:rFonts w:ascii="Arial" w:cs="Arial" w:eastAsia="Arial" w:hAnsi="Arial"/>
-                <w:color w:val="1A1A1A"/>
-                <w:sz w:val="18"/>
-                <w:szCs w:val="18"/>
+              <w:keepNext w:val="false"/>
+              <w:suppressAutoHyphens/>
+              <w:spacing w:after="0" w:before="0" w:line="252"/>
+              <w:jc w:val="left"/>
+            </w:pPr>
+            <w:r>
+              <w:rPr>
+                <w:rFonts w:ascii="Arial" w:cs="Arial" w:eastAsia="Arial" w:hAnsi="Arial"/>
+                <w:color w:val="1A1A1A"/>
+                <w:sz w:val="18"/>
+                <w:szCs w:val="18"/>
+                <w:lang w:val="es-AR"/>
               </w:rPr>
               <w:t xml:space="preserve">Integraciones operativas y controles de seguridad implementados</w:t>
             </w:r>
@@ -2268,15 +2445,18 @@
           </w:tcPr>
           <w:p>
             <w:pPr>
-              <w:spacing w:after="0" w:before="0" w:line="252"/>
-              <w:jc w:val="both"/>
-            </w:pPr>
-            <w:r>
-              <w:rPr>
-                <w:rFonts w:ascii="Arial" w:cs="Arial" w:eastAsia="Arial" w:hAnsi="Arial"/>
-                <w:color w:val="1A1A1A"/>
-                <w:sz w:val="18"/>
-                <w:szCs w:val="18"/>
+              <w:keepNext w:val="false"/>
+              <w:suppressAutoHyphens/>
+              <w:spacing w:after="0" w:before="0" w:line="252"/>
+              <w:jc w:val="left"/>
+            </w:pPr>
+            <w:r>
+              <w:rPr>
+                <w:rFonts w:ascii="Arial" w:cs="Arial" w:eastAsia="Arial" w:hAnsi="Arial"/>
+                <w:color w:val="1A1A1A"/>
+                <w:sz w:val="18"/>
+                <w:szCs w:val="18"/>
+                <w:lang w:val="es-AR"/>
               </w:rPr>
               <w:t xml:space="preserve">7. Migración de datos</w:t>
             </w:r>
@@ -2295,15 +2475,18 @@
           </w:tcPr>
           <w:p>
             <w:pPr>
-              <w:spacing w:after="0" w:before="0" w:line="252"/>
-              <w:jc w:val="both"/>
-            </w:pPr>
-            <w:r>
-              <w:rPr>
-                <w:rFonts w:ascii="Arial" w:cs="Arial" w:eastAsia="Arial" w:hAnsi="Arial"/>
-                <w:color w:val="1A1A1A"/>
-                <w:sz w:val="18"/>
-                <w:szCs w:val="18"/>
+              <w:keepNext w:val="false"/>
+              <w:suppressAutoHyphens/>
+              <w:spacing w:after="0" w:before="0" w:line="252"/>
+              <w:jc w:val="left"/>
+            </w:pPr>
+            <w:r>
+              <w:rPr>
+                <w:rFonts w:ascii="Arial" w:cs="Arial" w:eastAsia="Arial" w:hAnsi="Arial"/>
+                <w:color w:val="1A1A1A"/>
+                <w:sz w:val="18"/>
+                <w:szCs w:val="18"/>
+                <w:lang w:val="es-AR"/>
               </w:rPr>
               <w:t xml:space="preserve">Matriz de competencias y datos maestros cargados</w:t>
             </w:r>
@@ -2328,15 +2511,18 @@
           </w:tcPr>
           <w:p>
             <w:pPr>
-              <w:spacing w:after="0" w:before="0" w:line="252"/>
-              <w:jc w:val="both"/>
-            </w:pPr>
-            <w:r>
-              <w:rPr>
-                <w:rFonts w:ascii="Arial" w:cs="Arial" w:eastAsia="Arial" w:hAnsi="Arial"/>
-                <w:color w:val="1A1A1A"/>
-                <w:sz w:val="18"/>
-                <w:szCs w:val="18"/>
+              <w:keepNext w:val="false"/>
+              <w:suppressAutoHyphens/>
+              <w:spacing w:after="0" w:before="0" w:line="252"/>
+              <w:jc w:val="left"/>
+            </w:pPr>
+            <w:r>
+              <w:rPr>
+                <w:rFonts w:ascii="Arial" w:cs="Arial" w:eastAsia="Arial" w:hAnsi="Arial"/>
+                <w:color w:val="1A1A1A"/>
+                <w:sz w:val="18"/>
+                <w:szCs w:val="18"/>
+                <w:lang w:val="es-AR"/>
               </w:rPr>
               <w:t xml:space="preserve">8. Pruebas</w:t>
             </w:r>
@@ -2355,15 +2541,18 @@
           </w:tcPr>
           <w:p>
             <w:pPr>
-              <w:spacing w:after="0" w:before="0" w:line="252"/>
-              <w:jc w:val="both"/>
-            </w:pPr>
-            <w:r>
-              <w:rPr>
-                <w:rFonts w:ascii="Arial" w:cs="Arial" w:eastAsia="Arial" w:hAnsi="Arial"/>
-                <w:color w:val="1A1A1A"/>
-                <w:sz w:val="18"/>
-                <w:szCs w:val="18"/>
+              <w:keepNext w:val="false"/>
+              <w:suppressAutoHyphens/>
+              <w:spacing w:after="0" w:before="0" w:line="252"/>
+              <w:jc w:val="left"/>
+            </w:pPr>
+            <w:r>
+              <w:rPr>
+                <w:rFonts w:ascii="Arial" w:cs="Arial" w:eastAsia="Arial" w:hAnsi="Arial"/>
+                <w:color w:val="1A1A1A"/>
+                <w:sz w:val="18"/>
+                <w:szCs w:val="18"/>
+                <w:lang w:val="es-AR"/>
               </w:rPr>
               <w:t xml:space="preserve">Informe de pruebas funcionales, de integración y de seguridad</w:t>
             </w:r>
@@ -2388,15 +2577,18 @@
           </w:tcPr>
           <w:p>
             <w:pPr>
-              <w:spacing w:after="0" w:before="0" w:line="252"/>
-              <w:jc w:val="both"/>
-            </w:pPr>
-            <w:r>
-              <w:rPr>
-                <w:rFonts w:ascii="Arial" w:cs="Arial" w:eastAsia="Arial" w:hAnsi="Arial"/>
-                <w:color w:val="1A1A1A"/>
-                <w:sz w:val="18"/>
-                <w:szCs w:val="18"/>
+              <w:keepNext w:val="false"/>
+              <w:suppressAutoHyphens/>
+              <w:spacing w:after="0" w:before="0" w:line="252"/>
+              <w:jc w:val="left"/>
+            </w:pPr>
+            <w:r>
+              <w:rPr>
+                <w:rFonts w:ascii="Arial" w:cs="Arial" w:eastAsia="Arial" w:hAnsi="Arial"/>
+                <w:color w:val="1A1A1A"/>
+                <w:sz w:val="18"/>
+                <w:szCs w:val="18"/>
+                <w:lang w:val="es-AR"/>
               </w:rPr>
               <w:t xml:space="preserve">9. Piloto</w:t>
             </w:r>
@@ -2415,15 +2607,18 @@
           </w:tcPr>
           <w:p>
             <w:pPr>
-              <w:spacing w:after="0" w:before="0" w:line="252"/>
-              <w:jc w:val="both"/>
-            </w:pPr>
-            <w:r>
-              <w:rPr>
-                <w:rFonts w:ascii="Arial" w:cs="Arial" w:eastAsia="Arial" w:hAnsi="Arial"/>
-                <w:color w:val="1A1A1A"/>
-                <w:sz w:val="18"/>
-                <w:szCs w:val="18"/>
+              <w:keepNext w:val="false"/>
+              <w:suppressAutoHyphens/>
+              <w:spacing w:after="0" w:before="0" w:line="252"/>
+              <w:jc w:val="left"/>
+            </w:pPr>
+            <w:r>
+              <w:rPr>
+                <w:rFonts w:ascii="Arial" w:cs="Arial" w:eastAsia="Arial" w:hAnsi="Arial"/>
+                <w:color w:val="1A1A1A"/>
+                <w:sz w:val="18"/>
+                <w:szCs w:val="18"/>
+                <w:lang w:val="es-AR"/>
               </w:rPr>
               <w:t xml:space="preserve">Informe de piloto en zona acotada, con ajustes aplicados</w:t>
             </w:r>
@@ -2448,15 +2643,18 @@
           </w:tcPr>
           <w:p>
             <w:pPr>
-              <w:spacing w:after="0" w:before="0" w:line="252"/>
-              <w:jc w:val="both"/>
-            </w:pPr>
-            <w:r>
-              <w:rPr>
-                <w:rFonts w:ascii="Arial" w:cs="Arial" w:eastAsia="Arial" w:hAnsi="Arial"/>
-                <w:color w:val="1A1A1A"/>
-                <w:sz w:val="18"/>
-                <w:szCs w:val="18"/>
+              <w:keepNext w:val="false"/>
+              <w:suppressAutoHyphens/>
+              <w:spacing w:after="0" w:before="0" w:line="252"/>
+              <w:jc w:val="left"/>
+            </w:pPr>
+            <w:r>
+              <w:rPr>
+                <w:rFonts w:ascii="Arial" w:cs="Arial" w:eastAsia="Arial" w:hAnsi="Arial"/>
+                <w:color w:val="1A1A1A"/>
+                <w:sz w:val="18"/>
+                <w:szCs w:val="18"/>
+                <w:lang w:val="es-AR"/>
               </w:rPr>
               <w:t xml:space="preserve">10. Capacitación</w:t>
             </w:r>
@@ -2475,15 +2673,18 @@
           </w:tcPr>
           <w:p>
             <w:pPr>
-              <w:spacing w:after="0" w:before="0" w:line="252"/>
-              <w:jc w:val="both"/>
-            </w:pPr>
-            <w:r>
-              <w:rPr>
-                <w:rFonts w:ascii="Arial" w:cs="Arial" w:eastAsia="Arial" w:hAnsi="Arial"/>
-                <w:color w:val="1A1A1A"/>
-                <w:sz w:val="18"/>
-                <w:szCs w:val="18"/>
+              <w:keepNext w:val="false"/>
+              <w:suppressAutoHyphens/>
+              <w:spacing w:after="0" w:before="0" w:line="252"/>
+              <w:jc w:val="left"/>
+            </w:pPr>
+            <w:r>
+              <w:rPr>
+                <w:rFonts w:ascii="Arial" w:cs="Arial" w:eastAsia="Arial" w:hAnsi="Arial"/>
+                <w:color w:val="1A1A1A"/>
+                <w:sz w:val="18"/>
+                <w:szCs w:val="18"/>
+                <w:lang w:val="es-AR"/>
               </w:rPr>
               <w:t xml:space="preserve">Técnicos, supervisores y despachantes capacitados</w:t>
             </w:r>
@@ -2508,15 +2709,18 @@
           </w:tcPr>
           <w:p>
             <w:pPr>
-              <w:spacing w:after="0" w:before="0" w:line="252"/>
-              <w:jc w:val="both"/>
-            </w:pPr>
-            <w:r>
-              <w:rPr>
-                <w:rFonts w:ascii="Arial" w:cs="Arial" w:eastAsia="Arial" w:hAnsi="Arial"/>
-                <w:color w:val="1A1A1A"/>
-                <w:sz w:val="18"/>
-                <w:szCs w:val="18"/>
+              <w:keepNext w:val="false"/>
+              <w:suppressAutoHyphens/>
+              <w:spacing w:after="0" w:before="0" w:line="252"/>
+              <w:jc w:val="left"/>
+            </w:pPr>
+            <w:r>
+              <w:rPr>
+                <w:rFonts w:ascii="Arial" w:cs="Arial" w:eastAsia="Arial" w:hAnsi="Arial"/>
+                <w:color w:val="1A1A1A"/>
+                <w:sz w:val="18"/>
+                <w:szCs w:val="18"/>
+                <w:lang w:val="es-AR"/>
               </w:rPr>
               <w:t xml:space="preserve">11. Despliegue por olas</w:t>
             </w:r>
@@ -2535,15 +2739,18 @@
           </w:tcPr>
           <w:p>
             <w:pPr>
-              <w:spacing w:after="0" w:before="0" w:line="252"/>
-              <w:jc w:val="both"/>
-            </w:pPr>
-            <w:r>
-              <w:rPr>
-                <w:rFonts w:ascii="Arial" w:cs="Arial" w:eastAsia="Arial" w:hAnsi="Arial"/>
-                <w:color w:val="1A1A1A"/>
-                <w:sz w:val="18"/>
-                <w:szCs w:val="18"/>
+              <w:keepNext w:val="false"/>
+              <w:suppressAutoHyphens/>
+              <w:spacing w:after="0" w:before="0" w:line="252"/>
+              <w:jc w:val="left"/>
+            </w:pPr>
+            <w:r>
+              <w:rPr>
+                <w:rFonts w:ascii="Arial" w:cs="Arial" w:eastAsia="Arial" w:hAnsi="Arial"/>
+                <w:color w:val="1A1A1A"/>
+                <w:sz w:val="18"/>
+                <w:szCs w:val="18"/>
+                <w:lang w:val="es-AR"/>
               </w:rPr>
               <w:t xml:space="preserve">Plataforma en producción en todas las zonas</w:t>
             </w:r>
@@ -2568,15 +2775,18 @@
           </w:tcPr>
           <w:p>
             <w:pPr>
-              <w:spacing w:after="0" w:before="0" w:line="252"/>
-              <w:jc w:val="both"/>
-            </w:pPr>
-            <w:r>
-              <w:rPr>
-                <w:rFonts w:ascii="Arial" w:cs="Arial" w:eastAsia="Arial" w:hAnsi="Arial"/>
-                <w:color w:val="1A1A1A"/>
-                <w:sz w:val="18"/>
-                <w:szCs w:val="18"/>
+              <w:keepNext w:val="false"/>
+              <w:suppressAutoHyphens/>
+              <w:spacing w:after="0" w:before="0" w:line="252"/>
+              <w:jc w:val="left"/>
+            </w:pPr>
+            <w:r>
+              <w:rPr>
+                <w:rFonts w:ascii="Arial" w:cs="Arial" w:eastAsia="Arial" w:hAnsi="Arial"/>
+                <w:color w:val="1A1A1A"/>
+                <w:sz w:val="18"/>
+                <w:szCs w:val="18"/>
+                <w:lang w:val="es-AR"/>
               </w:rPr>
               <w:t xml:space="preserve">12. Estabilización y cierre</w:t>
             </w:r>
@@ -2595,15 +2805,18 @@
           </w:tcPr>
           <w:p>
             <w:pPr>
-              <w:spacing w:after="0" w:before="0" w:line="252"/>
-              <w:jc w:val="both"/>
-            </w:pPr>
-            <w:r>
-              <w:rPr>
-                <w:rFonts w:ascii="Arial" w:cs="Arial" w:eastAsia="Arial" w:hAnsi="Arial"/>
-                <w:color w:val="1A1A1A"/>
-                <w:sz w:val="18"/>
-                <w:szCs w:val="18"/>
+              <w:keepNext w:val="false"/>
+              <w:suppressAutoHyphens/>
+              <w:spacing w:after="0" w:before="0" w:line="252"/>
+              <w:jc w:val="left"/>
+            </w:pPr>
+            <w:r>
+              <w:rPr>
+                <w:rFonts w:ascii="Arial" w:cs="Arial" w:eastAsia="Arial" w:hAnsi="Arial"/>
+                <w:color w:val="1A1A1A"/>
+                <w:sz w:val="18"/>
+                <w:szCs w:val="18"/>
+                <w:lang w:val="es-AR"/>
               </w:rPr>
               <w:t xml:space="preserve">Documentación, transferencia operativa, alta del elemento de configuración en la CMDB y cierre formal</w:t>
             </w:r>
@@ -2613,14 +2826,14 @@
     </w:tbl>
     <w:p>
       <w:pPr>
-        <w:spacing w:after="200"/>
+        <w:spacing w:after="160"/>
       </w:pPr>
     </w:p>
     <w:p>
       <w:pPr>
         <w:pStyle w:val="Heading2"/>
         <w:keepNext/>
-        <w:spacing w:after="140" w:before="400"/>
+        <w:spacing w:after="120" w:before="300"/>
       </w:pPr>
       <w:r>
         <w:rPr>
@@ -2631,6 +2844,7 @@
           <w:spacing w:val="18"/>
           <w:sz w:val="21"/>
           <w:szCs w:val="21"/>
+          <w:lang w:val="es-AR"/>
         </w:rPr>
         <w:t xml:space="preserve">OBJETIVOS</w:t>
       </w:r>
@@ -2675,6 +2889,8 @@
           </w:tcPr>
           <w:p>
             <w:pPr>
+              <w:keepNext/>
+              <w:suppressAutoHyphens/>
               <w:spacing w:after="0" w:before="0" w:line="252"/>
               <w:jc w:val="left"/>
             </w:pPr>
@@ -2686,6 +2902,7 @@
                 <w:color w:val="1A1A1A"/>
                 <w:sz w:val="18"/>
                 <w:szCs w:val="18"/>
+                <w:lang w:val="es-AR"/>
               </w:rPr>
               <w:t xml:space="preserve">#</w:t>
             </w:r>
@@ -2705,6 +2922,8 @@
           </w:tcPr>
           <w:p>
             <w:pPr>
+              <w:keepNext/>
+              <w:suppressAutoHyphens/>
               <w:spacing w:after="0" w:before="0" w:line="252"/>
               <w:jc w:val="left"/>
             </w:pPr>
@@ -2716,6 +2935,7 @@
                 <w:color w:val="1A1A1A"/>
                 <w:sz w:val="18"/>
                 <w:szCs w:val="18"/>
+                <w:lang w:val="es-AR"/>
               </w:rPr>
               <w:t xml:space="preserve">Objetivo</w:t>
             </w:r>
@@ -2735,6 +2955,8 @@
           </w:tcPr>
           <w:p>
             <w:pPr>
+              <w:keepNext/>
+              <w:suppressAutoHyphens/>
               <w:spacing w:after="0" w:before="0" w:line="252"/>
               <w:jc w:val="left"/>
             </w:pPr>
@@ -2746,6 +2968,7 @@
                 <w:color w:val="1A1A1A"/>
                 <w:sz w:val="18"/>
                 <w:szCs w:val="18"/>
+                <w:lang w:val="es-AR"/>
               </w:rPr>
               <w:t xml:space="preserve">Indicador</w:t>
             </w:r>
@@ -2765,6 +2988,8 @@
           </w:tcPr>
           <w:p>
             <w:pPr>
+              <w:keepNext/>
+              <w:suppressAutoHyphens/>
               <w:spacing w:after="0" w:before="0" w:line="252"/>
               <w:jc w:val="left"/>
             </w:pPr>
@@ -2776,6 +3001,7 @@
                 <w:color w:val="1A1A1A"/>
                 <w:sz w:val="18"/>
                 <w:szCs w:val="18"/>
+                <w:lang w:val="es-AR"/>
               </w:rPr>
               <w:t xml:space="preserve">Línea base</w:t>
             </w:r>
@@ -2795,6 +3021,8 @@
           </w:tcPr>
           <w:p>
             <w:pPr>
+              <w:keepNext/>
+              <w:suppressAutoHyphens/>
               <w:spacing w:after="0" w:before="0" w:line="252"/>
               <w:jc w:val="left"/>
             </w:pPr>
@@ -2806,6 +3034,7 @@
                 <w:color w:val="1A1A1A"/>
                 <w:sz w:val="18"/>
                 <w:szCs w:val="18"/>
+                <w:lang w:val="es-AR"/>
               </w:rPr>
               <w:t xml:space="preserve">Meta</w:t>
             </w:r>
@@ -2825,6 +3054,8 @@
           </w:tcPr>
           <w:p>
             <w:pPr>
+              <w:keepNext/>
+              <w:suppressAutoHyphens/>
               <w:spacing w:after="0" w:before="0" w:line="252"/>
               <w:jc w:val="left"/>
             </w:pPr>
@@ -2836,6 +3067,7 @@
                 <w:color w:val="1A1A1A"/>
                 <w:sz w:val="18"/>
                 <w:szCs w:val="18"/>
+                <w:lang w:val="es-AR"/>
               </w:rPr>
               <w:t xml:space="preserve">Plazo</w:t>
             </w:r>
@@ -2860,15 +3092,18 @@
           </w:tcPr>
           <w:p>
             <w:pPr>
-              <w:spacing w:after="0" w:before="0" w:line="252"/>
-              <w:jc w:val="left"/>
-            </w:pPr>
-            <w:r>
-              <w:rPr>
-                <w:rFonts w:ascii="Arial" w:cs="Arial" w:eastAsia="Arial" w:hAnsi="Arial"/>
-                <w:color w:val="1A1A1A"/>
-                <w:sz w:val="18"/>
-                <w:szCs w:val="18"/>
+              <w:keepNext/>
+              <w:suppressAutoHyphens/>
+              <w:spacing w:after="0" w:before="0" w:line="252"/>
+              <w:jc w:val="left"/>
+            </w:pPr>
+            <w:r>
+              <w:rPr>
+                <w:rFonts w:ascii="Arial" w:cs="Arial" w:eastAsia="Arial" w:hAnsi="Arial"/>
+                <w:color w:val="1A1A1A"/>
+                <w:sz w:val="18"/>
+                <w:szCs w:val="18"/>
+                <w:lang w:val="es-AR"/>
               </w:rPr>
               <w:t xml:space="preserve">O1</w:t>
             </w:r>
@@ -2887,15 +3122,18 @@
           </w:tcPr>
           <w:p>
             <w:pPr>
-              <w:spacing w:after="0" w:before="0" w:line="252"/>
-              <w:jc w:val="both"/>
-            </w:pPr>
-            <w:r>
-              <w:rPr>
-                <w:rFonts w:ascii="Arial" w:cs="Arial" w:eastAsia="Arial" w:hAnsi="Arial"/>
-                <w:color w:val="1A1A1A"/>
-                <w:sz w:val="18"/>
-                <w:szCs w:val="18"/>
+              <w:keepNext/>
+              <w:suppressAutoHyphens/>
+              <w:spacing w:after="0" w:before="0" w:line="252"/>
+              <w:jc w:val="left"/>
+            </w:pPr>
+            <w:r>
+              <w:rPr>
+                <w:rFonts w:ascii="Arial" w:cs="Arial" w:eastAsia="Arial" w:hAnsi="Arial"/>
+                <w:color w:val="1A1A1A"/>
+                <w:sz w:val="18"/>
+                <w:szCs w:val="18"/>
+                <w:lang w:val="es-AR"/>
               </w:rPr>
               <w:t xml:space="preserve">Aumentar la productividad del técnico de campo</w:t>
             </w:r>
@@ -2914,15 +3152,18 @@
           </w:tcPr>
           <w:p>
             <w:pPr>
-              <w:spacing w:after="0" w:before="0" w:line="252"/>
-              <w:jc w:val="both"/>
-            </w:pPr>
-            <w:r>
-              <w:rPr>
-                <w:rFonts w:ascii="Arial" w:cs="Arial" w:eastAsia="Arial" w:hAnsi="Arial"/>
-                <w:color w:val="1A1A1A"/>
-                <w:sz w:val="18"/>
-                <w:szCs w:val="18"/>
+              <w:keepNext/>
+              <w:suppressAutoHyphens/>
+              <w:spacing w:after="0" w:before="0" w:line="252"/>
+              <w:jc w:val="left"/>
+            </w:pPr>
+            <w:r>
+              <w:rPr>
+                <w:rFonts w:ascii="Arial" w:cs="Arial" w:eastAsia="Arial" w:hAnsi="Arial"/>
+                <w:color w:val="1A1A1A"/>
+                <w:sz w:val="18"/>
+                <w:szCs w:val="18"/>
+                <w:lang w:val="es-AR"/>
               </w:rPr>
               <w:t xml:space="preserve">Instalaciones finalizadas conformes ÷ horas-técnico disponibles</w:t>
             </w:r>
@@ -2941,15 +3182,18 @@
           </w:tcPr>
           <w:p>
             <w:pPr>
-              <w:spacing w:after="0" w:before="0" w:line="252"/>
-              <w:jc w:val="left"/>
-            </w:pPr>
-            <w:r>
-              <w:rPr>
-                <w:rFonts w:ascii="Arial" w:cs="Arial" w:eastAsia="Arial" w:hAnsi="Arial"/>
-                <w:color w:val="1A1A1A"/>
-                <w:sz w:val="18"/>
-                <w:szCs w:val="18"/>
+              <w:keepNext/>
+              <w:suppressAutoHyphens/>
+              <w:spacing w:after="0" w:before="0" w:line="252"/>
+              <w:jc w:val="left"/>
+            </w:pPr>
+            <w:r>
+              <w:rPr>
+                <w:rFonts w:ascii="Arial" w:cs="Arial" w:eastAsia="Arial" w:hAnsi="Arial"/>
+                <w:color w:val="1A1A1A"/>
+                <w:sz w:val="18"/>
+                <w:szCs w:val="18"/>
+                <w:lang w:val="es-AR"/>
               </w:rPr>
               <w:t xml:space="preserve">0,50 inst./hora-técnico </w:t>
             </w:r>
@@ -2961,6 +3205,7 @@
                 <w:color w:val="1A1A1A"/>
                 <w:sz w:val="18"/>
                 <w:szCs w:val="18"/>
+                <w:lang w:val="es-AR"/>
               </w:rPr>
               <w:t xml:space="preserve">(supuesto)</w:t>
             </w:r>
@@ -2979,15 +3224,18 @@
           </w:tcPr>
           <w:p>
             <w:pPr>
-              <w:spacing w:after="0" w:before="0" w:line="252"/>
-              <w:jc w:val="left"/>
-            </w:pPr>
-            <w:r>
-              <w:rPr>
-                <w:rFonts w:ascii="Arial" w:cs="Arial" w:eastAsia="Arial" w:hAnsi="Arial"/>
-                <w:color w:val="1A1A1A"/>
-                <w:sz w:val="18"/>
-                <w:szCs w:val="18"/>
+              <w:keepNext/>
+              <w:suppressAutoHyphens/>
+              <w:spacing w:after="0" w:before="0" w:line="252"/>
+              <w:jc w:val="left"/>
+            </w:pPr>
+            <w:r>
+              <w:rPr>
+                <w:rFonts w:ascii="Arial" w:cs="Arial" w:eastAsia="Arial" w:hAnsi="Arial"/>
+                <w:color w:val="1A1A1A"/>
+                <w:sz w:val="18"/>
+                <w:szCs w:val="18"/>
+                <w:lang w:val="es-AR"/>
               </w:rPr>
               <w:t xml:space="preserve">0,525 (+5%)</w:t>
             </w:r>
@@ -3006,15 +3254,18 @@
           </w:tcPr>
           <w:p>
             <w:pPr>
-              <w:spacing w:after="0" w:before="0" w:line="252"/>
-              <w:jc w:val="left"/>
-            </w:pPr>
-            <w:r>
-              <w:rPr>
-                <w:rFonts w:ascii="Arial" w:cs="Arial" w:eastAsia="Arial" w:hAnsi="Arial"/>
-                <w:color w:val="1A1A1A"/>
-                <w:sz w:val="18"/>
-                <w:szCs w:val="18"/>
+              <w:keepNext/>
+              <w:suppressAutoHyphens/>
+              <w:spacing w:after="0" w:before="0" w:line="252"/>
+              <w:jc w:val="left"/>
+            </w:pPr>
+            <w:r>
+              <w:rPr>
+                <w:rFonts w:ascii="Arial" w:cs="Arial" w:eastAsia="Arial" w:hAnsi="Arial"/>
+                <w:color w:val="1A1A1A"/>
+                <w:sz w:val="18"/>
+                <w:szCs w:val="18"/>
+                <w:lang w:val="es-AR"/>
               </w:rPr>
               <w:t xml:space="preserve">6 meses desde la puesta en producción</w:t>
             </w:r>
@@ -3039,15 +3290,18 @@
           </w:tcPr>
           <w:p>
             <w:pPr>
-              <w:spacing w:after="0" w:before="0" w:line="252"/>
-              <w:jc w:val="left"/>
-            </w:pPr>
-            <w:r>
-              <w:rPr>
-                <w:rFonts w:ascii="Arial" w:cs="Arial" w:eastAsia="Arial" w:hAnsi="Arial"/>
-                <w:color w:val="1A1A1A"/>
-                <w:sz w:val="18"/>
-                <w:szCs w:val="18"/>
+              <w:keepNext/>
+              <w:suppressAutoHyphens/>
+              <w:spacing w:after="0" w:before="0" w:line="252"/>
+              <w:jc w:val="left"/>
+            </w:pPr>
+            <w:r>
+              <w:rPr>
+                <w:rFonts w:ascii="Arial" w:cs="Arial" w:eastAsia="Arial" w:hAnsi="Arial"/>
+                <w:color w:val="1A1A1A"/>
+                <w:sz w:val="18"/>
+                <w:szCs w:val="18"/>
+                <w:lang w:val="es-AR"/>
               </w:rPr>
               <w:t xml:space="preserve">O2</w:t>
             </w:r>
@@ -3066,15 +3320,18 @@
           </w:tcPr>
           <w:p>
             <w:pPr>
-              <w:spacing w:after="0" w:before="0" w:line="252"/>
-              <w:jc w:val="both"/>
-            </w:pPr>
-            <w:r>
-              <w:rPr>
-                <w:rFonts w:ascii="Arial" w:cs="Arial" w:eastAsia="Arial" w:hAnsi="Arial"/>
-                <w:color w:val="1A1A1A"/>
-                <w:sz w:val="18"/>
-                <w:szCs w:val="18"/>
+              <w:keepNext/>
+              <w:suppressAutoHyphens/>
+              <w:spacing w:after="0" w:before="0" w:line="252"/>
+              <w:jc w:val="left"/>
+            </w:pPr>
+            <w:r>
+              <w:rPr>
+                <w:rFonts w:ascii="Arial" w:cs="Arial" w:eastAsia="Arial" w:hAnsi="Arial"/>
+                <w:color w:val="1A1A1A"/>
+                <w:sz w:val="18"/>
+                <w:szCs w:val="18"/>
+                <w:lang w:val="es-AR"/>
               </w:rPr>
               <w:t xml:space="preserve">Reducir la latencia de registro del cierre de la orden de trabajo</w:t>
             </w:r>
@@ -3093,15 +3350,18 @@
           </w:tcPr>
           <w:p>
             <w:pPr>
-              <w:spacing w:after="0" w:before="0" w:line="252"/>
-              <w:jc w:val="both"/>
-            </w:pPr>
-            <w:r>
-              <w:rPr>
-                <w:rFonts w:ascii="Arial" w:cs="Arial" w:eastAsia="Arial" w:hAnsi="Arial"/>
-                <w:color w:val="1A1A1A"/>
-                <w:sz w:val="18"/>
-                <w:szCs w:val="18"/>
+              <w:keepNext/>
+              <w:suppressAutoHyphens/>
+              <w:spacing w:after="0" w:before="0" w:line="252"/>
+              <w:jc w:val="left"/>
+            </w:pPr>
+            <w:r>
+              <w:rPr>
+                <w:rFonts w:ascii="Arial" w:cs="Arial" w:eastAsia="Arial" w:hAnsi="Arial"/>
+                <w:color w:val="1A1A1A"/>
+                <w:sz w:val="18"/>
+                <w:szCs w:val="18"/>
+                <w:lang w:val="es-AR"/>
               </w:rPr>
               <w:t xml:space="preserve">% de órdenes cerradas en el sistema dentro de los 15 minutos de terminada la visita, y tiempo medio entre asignación y cierre</w:t>
             </w:r>
@@ -3120,15 +3380,18 @@
           </w:tcPr>
           <w:p>
             <w:pPr>
-              <w:spacing w:after="0" w:before="0" w:line="252"/>
-              <w:jc w:val="left"/>
-            </w:pPr>
-            <w:r>
-              <w:rPr>
-                <w:rFonts w:ascii="Arial" w:cs="Arial" w:eastAsia="Arial" w:hAnsi="Arial"/>
-                <w:color w:val="1A1A1A"/>
-                <w:sz w:val="18"/>
-                <w:szCs w:val="18"/>
+              <w:keepNext/>
+              <w:suppressAutoHyphens/>
+              <w:spacing w:after="0" w:before="0" w:line="252"/>
+              <w:jc w:val="left"/>
+            </w:pPr>
+            <w:r>
+              <w:rPr>
+                <w:rFonts w:ascii="Arial" w:cs="Arial" w:eastAsia="Arial" w:hAnsi="Arial"/>
+                <w:color w:val="1A1A1A"/>
+                <w:sz w:val="18"/>
+                <w:szCs w:val="18"/>
+                <w:lang w:val="es-AR"/>
               </w:rPr>
               <w:t xml:space="preserve">20% · 26 h </w:t>
             </w:r>
@@ -3140,6 +3403,7 @@
                 <w:color w:val="1A1A1A"/>
                 <w:sz w:val="18"/>
                 <w:szCs w:val="18"/>
+                <w:lang w:val="es-AR"/>
               </w:rPr>
               <w:t xml:space="preserve">(supuesto)</w:t>
             </w:r>
@@ -3158,15 +3422,18 @@
           </w:tcPr>
           <w:p>
             <w:pPr>
-              <w:spacing w:after="0" w:before="0" w:line="252"/>
-              <w:jc w:val="left"/>
-            </w:pPr>
-            <w:r>
-              <w:rPr>
-                <w:rFonts w:ascii="Arial" w:cs="Arial" w:eastAsia="Arial" w:hAnsi="Arial"/>
-                <w:color w:val="1A1A1A"/>
-                <w:sz w:val="18"/>
-                <w:szCs w:val="18"/>
+              <w:keepNext/>
+              <w:suppressAutoHyphens/>
+              <w:spacing w:after="0" w:before="0" w:line="252"/>
+              <w:jc w:val="left"/>
+            </w:pPr>
+            <w:r>
+              <w:rPr>
+                <w:rFonts w:ascii="Arial" w:cs="Arial" w:eastAsia="Arial" w:hAnsi="Arial"/>
+                <w:color w:val="1A1A1A"/>
+                <w:sz w:val="18"/>
+                <w:szCs w:val="18"/>
+                <w:lang w:val="es-AR"/>
               </w:rPr>
               <w:t xml:space="preserve">≥90% · ≤8 h</w:t>
             </w:r>
@@ -3185,15 +3452,18 @@
           </w:tcPr>
           <w:p>
             <w:pPr>
-              <w:spacing w:after="0" w:before="0" w:line="252"/>
-              <w:jc w:val="left"/>
-            </w:pPr>
-            <w:r>
-              <w:rPr>
-                <w:rFonts w:ascii="Arial" w:cs="Arial" w:eastAsia="Arial" w:hAnsi="Arial"/>
-                <w:color w:val="1A1A1A"/>
-                <w:sz w:val="18"/>
-                <w:szCs w:val="18"/>
+              <w:keepNext/>
+              <w:suppressAutoHyphens/>
+              <w:spacing w:after="0" w:before="0" w:line="252"/>
+              <w:jc w:val="left"/>
+            </w:pPr>
+            <w:r>
+              <w:rPr>
+                <w:rFonts w:ascii="Arial" w:cs="Arial" w:eastAsia="Arial" w:hAnsi="Arial"/>
+                <w:color w:val="1A1A1A"/>
+                <w:sz w:val="18"/>
+                <w:szCs w:val="18"/>
+                <w:lang w:val="es-AR"/>
               </w:rPr>
               <w:t xml:space="preserve">Mes 4, sostenido 3 meses</w:t>
             </w:r>
@@ -3218,15 +3488,18 @@
           </w:tcPr>
           <w:p>
             <w:pPr>
-              <w:spacing w:after="0" w:before="0" w:line="252"/>
-              <w:jc w:val="left"/>
-            </w:pPr>
-            <w:r>
-              <w:rPr>
-                <w:rFonts w:ascii="Arial" w:cs="Arial" w:eastAsia="Arial" w:hAnsi="Arial"/>
-                <w:color w:val="1A1A1A"/>
-                <w:sz w:val="18"/>
-                <w:szCs w:val="18"/>
+              <w:keepNext/>
+              <w:suppressAutoHyphens/>
+              <w:spacing w:after="0" w:before="0" w:line="252"/>
+              <w:jc w:val="left"/>
+            </w:pPr>
+            <w:r>
+              <w:rPr>
+                <w:rFonts w:ascii="Arial" w:cs="Arial" w:eastAsia="Arial" w:hAnsi="Arial"/>
+                <w:color w:val="1A1A1A"/>
+                <w:sz w:val="18"/>
+                <w:szCs w:val="18"/>
+                <w:lang w:val="es-AR"/>
               </w:rPr>
               <w:t xml:space="preserve">O3</w:t>
             </w:r>
@@ -3245,15 +3518,18 @@
           </w:tcPr>
           <w:p>
             <w:pPr>
-              <w:spacing w:after="0" w:before="0" w:line="252"/>
-              <w:jc w:val="both"/>
-            </w:pPr>
-            <w:r>
-              <w:rPr>
-                <w:rFonts w:ascii="Arial" w:cs="Arial" w:eastAsia="Arial" w:hAnsi="Arial"/>
-                <w:color w:val="1A1A1A"/>
-                <w:sz w:val="18"/>
-                <w:szCs w:val="18"/>
+              <w:keepNext/>
+              <w:suppressAutoHyphens/>
+              <w:spacing w:after="0" w:before="0" w:line="252"/>
+              <w:jc w:val="left"/>
+            </w:pPr>
+            <w:r>
+              <w:rPr>
+                <w:rFonts w:ascii="Arial" w:cs="Arial" w:eastAsia="Arial" w:hAnsi="Arial"/>
+                <w:color w:val="1A1A1A"/>
+                <w:sz w:val="18"/>
+                <w:szCs w:val="18"/>
+                <w:lang w:val="es-AR"/>
               </w:rPr>
               <w:t xml:space="preserve">Reducir las visitas fallidas por causa evitable</w:t>
             </w:r>
@@ -3272,15 +3548,18 @@
           </w:tcPr>
           <w:p>
             <w:pPr>
-              <w:spacing w:after="0" w:before="0" w:line="252"/>
-              <w:jc w:val="both"/>
-            </w:pPr>
-            <w:r>
-              <w:rPr>
-                <w:rFonts w:ascii="Arial" w:cs="Arial" w:eastAsia="Arial" w:hAnsi="Arial"/>
-                <w:color w:val="1A1A1A"/>
-                <w:sz w:val="18"/>
-                <w:szCs w:val="18"/>
+              <w:keepNext/>
+              <w:suppressAutoHyphens/>
+              <w:spacing w:after="0" w:before="0" w:line="252"/>
+              <w:jc w:val="left"/>
+            </w:pPr>
+            <w:r>
+              <w:rPr>
+                <w:rFonts w:ascii="Arial" w:cs="Arial" w:eastAsia="Arial" w:hAnsi="Arial"/>
+                <w:color w:val="1A1A1A"/>
+                <w:sz w:val="18"/>
+                <w:szCs w:val="18"/>
+                <w:lang w:val="es-AR"/>
               </w:rPr>
               <w:t xml:space="preserve">Órdenes reprogramadas por "técnico sin competencia" o "kit incompleto" ÷ órdenes despachadas</w:t>
             </w:r>
@@ -3299,15 +3578,18 @@
           </w:tcPr>
           <w:p>
             <w:pPr>
-              <w:spacing w:after="0" w:before="0" w:line="252"/>
-              <w:jc w:val="left"/>
-            </w:pPr>
-            <w:r>
-              <w:rPr>
-                <w:rFonts w:ascii="Arial" w:cs="Arial" w:eastAsia="Arial" w:hAnsi="Arial"/>
-                <w:color w:val="1A1A1A"/>
-                <w:sz w:val="18"/>
-                <w:szCs w:val="18"/>
+              <w:keepNext/>
+              <w:suppressAutoHyphens/>
+              <w:spacing w:after="0" w:before="0" w:line="252"/>
+              <w:jc w:val="left"/>
+            </w:pPr>
+            <w:r>
+              <w:rPr>
+                <w:rFonts w:ascii="Arial" w:cs="Arial" w:eastAsia="Arial" w:hAnsi="Arial"/>
+                <w:color w:val="1A1A1A"/>
+                <w:sz w:val="18"/>
+                <w:szCs w:val="18"/>
+                <w:lang w:val="es-AR"/>
               </w:rPr>
               <w:t xml:space="preserve">12% </w:t>
             </w:r>
@@ -3319,6 +3601,7 @@
                 <w:color w:val="1A1A1A"/>
                 <w:sz w:val="18"/>
                 <w:szCs w:val="18"/>
+                <w:lang w:val="es-AR"/>
               </w:rPr>
               <w:t xml:space="preserve">(supuesto)</w:t>
             </w:r>
@@ -3337,15 +3620,18 @@
           </w:tcPr>
           <w:p>
             <w:pPr>
-              <w:spacing w:after="0" w:before="0" w:line="252"/>
-              <w:jc w:val="left"/>
-            </w:pPr>
-            <w:r>
-              <w:rPr>
-                <w:rFonts w:ascii="Arial" w:cs="Arial" w:eastAsia="Arial" w:hAnsi="Arial"/>
-                <w:color w:val="1A1A1A"/>
-                <w:sz w:val="18"/>
-                <w:szCs w:val="18"/>
+              <w:keepNext/>
+              <w:suppressAutoHyphens/>
+              <w:spacing w:after="0" w:before="0" w:line="252"/>
+              <w:jc w:val="left"/>
+            </w:pPr>
+            <w:r>
+              <w:rPr>
+                <w:rFonts w:ascii="Arial" w:cs="Arial" w:eastAsia="Arial" w:hAnsi="Arial"/>
+                <w:color w:val="1A1A1A"/>
+                <w:sz w:val="18"/>
+                <w:szCs w:val="18"/>
+                <w:lang w:val="es-AR"/>
               </w:rPr>
               <w:t xml:space="preserve">≤6%</w:t>
             </w:r>
@@ -3364,15 +3650,18 @@
           </w:tcPr>
           <w:p>
             <w:pPr>
-              <w:spacing w:after="0" w:before="0" w:line="252"/>
-              <w:jc w:val="left"/>
-            </w:pPr>
-            <w:r>
-              <w:rPr>
-                <w:rFonts w:ascii="Arial" w:cs="Arial" w:eastAsia="Arial" w:hAnsi="Arial"/>
-                <w:color w:val="1A1A1A"/>
-                <w:sz w:val="18"/>
-                <w:szCs w:val="18"/>
+              <w:keepNext/>
+              <w:suppressAutoHyphens/>
+              <w:spacing w:after="0" w:before="0" w:line="252"/>
+              <w:jc w:val="left"/>
+            </w:pPr>
+            <w:r>
+              <w:rPr>
+                <w:rFonts w:ascii="Arial" w:cs="Arial" w:eastAsia="Arial" w:hAnsi="Arial"/>
+                <w:color w:val="1A1A1A"/>
+                <w:sz w:val="18"/>
+                <w:szCs w:val="18"/>
+                <w:lang w:val="es-AR"/>
               </w:rPr>
               <w:t xml:space="preserve">6 meses desde la puesta en producción</w:t>
             </w:r>
@@ -3397,15 +3686,18 @@
           </w:tcPr>
           <w:p>
             <w:pPr>
-              <w:spacing w:after="0" w:before="0" w:line="252"/>
-              <w:jc w:val="left"/>
-            </w:pPr>
-            <w:r>
-              <w:rPr>
-                <w:rFonts w:ascii="Arial" w:cs="Arial" w:eastAsia="Arial" w:hAnsi="Arial"/>
-                <w:color w:val="1A1A1A"/>
-                <w:sz w:val="18"/>
-                <w:szCs w:val="18"/>
+              <w:keepNext w:val="false"/>
+              <w:suppressAutoHyphens/>
+              <w:spacing w:after="0" w:before="0" w:line="252"/>
+              <w:jc w:val="left"/>
+            </w:pPr>
+            <w:r>
+              <w:rPr>
+                <w:rFonts w:ascii="Arial" w:cs="Arial" w:eastAsia="Arial" w:hAnsi="Arial"/>
+                <w:color w:val="1A1A1A"/>
+                <w:sz w:val="18"/>
+                <w:szCs w:val="18"/>
+                <w:lang w:val="es-AR"/>
               </w:rPr>
               <w:t xml:space="preserve">O4</w:t>
             </w:r>
@@ -3424,15 +3716,18 @@
           </w:tcPr>
           <w:p>
             <w:pPr>
-              <w:spacing w:after="0" w:before="0" w:line="252"/>
-              <w:jc w:val="both"/>
-            </w:pPr>
-            <w:r>
-              <w:rPr>
-                <w:rFonts w:ascii="Arial" w:cs="Arial" w:eastAsia="Arial" w:hAnsi="Arial"/>
-                <w:color w:val="1A1A1A"/>
-                <w:sz w:val="18"/>
-                <w:szCs w:val="18"/>
+              <w:keepNext w:val="false"/>
+              <w:suppressAutoHyphens/>
+              <w:spacing w:after="0" w:before="0" w:line="252"/>
+              <w:jc w:val="left"/>
+            </w:pPr>
+            <w:r>
+              <w:rPr>
+                <w:rFonts w:ascii="Arial" w:cs="Arial" w:eastAsia="Arial" w:hAnsi="Arial"/>
+                <w:color w:val="1A1A1A"/>
+                <w:sz w:val="18"/>
+                <w:szCs w:val="18"/>
+                <w:lang w:val="es-AR"/>
               </w:rPr>
               <w:t xml:space="preserve">Asegurar el cumplimiento de la priorización de la cola</w:t>
             </w:r>
@@ -3451,15 +3746,18 @@
           </w:tcPr>
           <w:p>
             <w:pPr>
-              <w:spacing w:after="0" w:before="0" w:line="252"/>
-              <w:jc w:val="both"/>
-            </w:pPr>
-            <w:r>
-              <w:rPr>
-                <w:rFonts w:ascii="Arial" w:cs="Arial" w:eastAsia="Arial" w:hAnsi="Arial"/>
-                <w:color w:val="1A1A1A"/>
-                <w:sz w:val="18"/>
-                <w:szCs w:val="18"/>
+              <w:keepNext w:val="false"/>
+              <w:suppressAutoHyphens/>
+              <w:spacing w:after="0" w:before="0" w:line="252"/>
+              <w:jc w:val="left"/>
+            </w:pPr>
+            <w:r>
+              <w:rPr>
+                <w:rFonts w:ascii="Arial" w:cs="Arial" w:eastAsia="Arial" w:hAnsi="Arial"/>
+                <w:color w:val="1A1A1A"/>
+                <w:sz w:val="18"/>
+                <w:szCs w:val="18"/>
+                <w:lang w:val="es-AR"/>
               </w:rPr>
               <w:t xml:space="preserve">% de órdenes despachadas según el orden del motor de priorización, y % de cumplimiento del SLA de primera respuesta</w:t>
             </w:r>
@@ -3478,15 +3776,18 @@
           </w:tcPr>
           <w:p>
             <w:pPr>
-              <w:spacing w:after="0" w:before="0" w:line="252"/>
-              <w:jc w:val="left"/>
-            </w:pPr>
-            <w:r>
-              <w:rPr>
-                <w:rFonts w:ascii="Arial" w:cs="Arial" w:eastAsia="Arial" w:hAnsi="Arial"/>
-                <w:color w:val="1A1A1A"/>
-                <w:sz w:val="18"/>
-                <w:szCs w:val="18"/>
+              <w:keepNext w:val="false"/>
+              <w:suppressAutoHyphens/>
+              <w:spacing w:after="0" w:before="0" w:line="252"/>
+              <w:jc w:val="left"/>
+            </w:pPr>
+            <w:r>
+              <w:rPr>
+                <w:rFonts w:ascii="Arial" w:cs="Arial" w:eastAsia="Arial" w:hAnsi="Arial"/>
+                <w:color w:val="1A1A1A"/>
+                <w:sz w:val="18"/>
+                <w:szCs w:val="18"/>
+                <w:lang w:val="es-AR"/>
               </w:rPr>
               <w:t xml:space="preserve">No medible en la situación actual — esa imposibilidad </w:t>
             </w:r>
@@ -3498,6 +3799,7 @@
                 <w:color w:val="1A1A1A"/>
                 <w:sz w:val="18"/>
                 <w:szCs w:val="18"/>
+                <w:lang w:val="es-AR"/>
               </w:rPr>
               <w:t xml:space="preserve">es</w:t>
             </w:r>
@@ -3507,6 +3809,7 @@
                 <w:color w:val="1A1A1A"/>
                 <w:sz w:val="18"/>
                 <w:szCs w:val="18"/>
+                <w:lang w:val="es-AR"/>
               </w:rPr>
               <w:t xml:space="preserve"> la definición del riesgo R07</w:t>
             </w:r>
@@ -3525,15 +3828,18 @@
           </w:tcPr>
           <w:p>
             <w:pPr>
-              <w:spacing w:after="0" w:before="0" w:line="252"/>
-              <w:jc w:val="left"/>
-            </w:pPr>
-            <w:r>
-              <w:rPr>
-                <w:rFonts w:ascii="Arial" w:cs="Arial" w:eastAsia="Arial" w:hAnsi="Arial"/>
-                <w:color w:val="1A1A1A"/>
-                <w:sz w:val="18"/>
-                <w:szCs w:val="18"/>
+              <w:keepNext w:val="false"/>
+              <w:suppressAutoHyphens/>
+              <w:spacing w:after="0" w:before="0" w:line="252"/>
+              <w:jc w:val="left"/>
+            </w:pPr>
+            <w:r>
+              <w:rPr>
+                <w:rFonts w:ascii="Arial" w:cs="Arial" w:eastAsia="Arial" w:hAnsi="Arial"/>
+                <w:color w:val="1A1A1A"/>
+                <w:sz w:val="18"/>
+                <w:szCs w:val="18"/>
+                <w:lang w:val="es-AR"/>
               </w:rPr>
               <w:t xml:space="preserve">≥95% · ≥90%</w:t>
             </w:r>
@@ -3552,15 +3858,18 @@
           </w:tcPr>
           <w:p>
             <w:pPr>
-              <w:spacing w:after="0" w:before="0" w:line="252"/>
-              <w:jc w:val="left"/>
-            </w:pPr>
-            <w:r>
-              <w:rPr>
-                <w:rFonts w:ascii="Arial" w:cs="Arial" w:eastAsia="Arial" w:hAnsi="Arial"/>
-                <w:color w:val="1A1A1A"/>
-                <w:sz w:val="18"/>
-                <w:szCs w:val="18"/>
+              <w:keepNext w:val="false"/>
+              <w:suppressAutoHyphens/>
+              <w:spacing w:after="0" w:before="0" w:line="252"/>
+              <w:jc w:val="left"/>
+            </w:pPr>
+            <w:r>
+              <w:rPr>
+                <w:rFonts w:ascii="Arial" w:cs="Arial" w:eastAsia="Arial" w:hAnsi="Arial"/>
+                <w:color w:val="1A1A1A"/>
+                <w:sz w:val="18"/>
+                <w:szCs w:val="18"/>
+                <w:lang w:val="es-AR"/>
               </w:rPr>
               <w:t xml:space="preserve">Mes 3 desde la puesta en producción</w:t>
             </w:r>
@@ -3570,7 +3879,7 @@
     </w:tbl>
     <w:p>
       <w:pPr>
-        <w:spacing w:after="200"/>
+        <w:spacing w:after="160"/>
       </w:pPr>
     </w:p>
     <w:p>
@@ -3587,6 +3896,7 @@
           <w:color w:val="1A1A1A"/>
           <w:sz w:val="20"/>
           <w:szCs w:val="20"/>
+          <w:lang w:val="es-AR"/>
         </w:rPr>
         <w:t xml:space="preserve">Sobre las líneas base.</w:t>
       </w:r>
@@ -3596,6 +3906,7 @@
           <w:color w:val="1A1A1A"/>
           <w:sz w:val="20"/>
           <w:szCs w:val="20"/>
+          <w:lang w:val="es-AR"/>
         </w:rPr>
         <w:t xml:space="preserve"> Los valores indicados como </w:t>
       </w:r>
@@ -3607,6 +3918,7 @@
           <w:color w:val="1A1A1A"/>
           <w:sz w:val="20"/>
           <w:szCs w:val="20"/>
+          <w:lang w:val="es-AR"/>
         </w:rPr>
         <w:t xml:space="preserve">supuesto</w:t>
       </w:r>
@@ -3616,6 +3928,7 @@
           <w:color w:val="1A1A1A"/>
           <w:sz w:val="20"/>
           <w:szCs w:val="20"/>
+          <w:lang w:val="es-AR"/>
         </w:rPr>
         <w:t xml:space="preserve"> son estimaciones: las Etapas 1 y 2 de este trabajo no relevaron indicadores de operación. Su medición formal constituye un entregable propio de la fase 2 (Relevamiento y análisis), y las metas se recalibrarán sobre los valores reales medidos.</w:t>
       </w:r>
@@ -3624,7 +3937,7 @@
       <w:pPr>
         <w:pStyle w:val="Heading2"/>
         <w:keepNext/>
-        <w:spacing w:after="140" w:before="400"/>
+        <w:spacing w:after="120" w:before="300"/>
       </w:pPr>
       <w:r>
         <w:rPr>
@@ -3635,21 +3948,23 @@
           <w:spacing w:val="18"/>
           <w:sz w:val="21"/>
           <w:szCs w:val="21"/>
+          <w:lang w:val="es-AR"/>
         </w:rPr>
         <w:t xml:space="preserve">LÍMITE</w:t>
       </w:r>
     </w:p>
     <w:p>
       <w:pPr>
-        <w:spacing w:after="140" w:line="288"/>
-        <w:jc w:val="both"/>
-      </w:pPr>
-      <w:r>
-        <w:rPr>
-          <w:rFonts w:ascii="Arial" w:cs="Arial" w:eastAsia="Arial" w:hAnsi="Arial"/>
-          <w:color w:val="1A1A1A"/>
-          <w:sz w:val="22"/>
-          <w:szCs w:val="22"/>
+        <w:spacing w:after="120" w:line="280"/>
+        <w:jc w:val="both"/>
+      </w:pPr>
+      <w:r>
+        <w:rPr>
+          <w:rFonts w:ascii="Arial" w:cs="Arial" w:eastAsia="Arial" w:hAnsi="Arial"/>
+          <w:color w:val="1A1A1A"/>
+          <w:sz w:val="22"/>
+          <w:szCs w:val="22"/>
+          <w:lang w:val="es-AR"/>
         </w:rPr>
         <w:t xml:space="preserve">El proyecto </w:t>
       </w:r>
@@ -3661,6 +3976,7 @@
           <w:color w:val="1A1A1A"/>
           <w:sz w:val="22"/>
           <w:szCs w:val="22"/>
+          <w:lang w:val="es-AR"/>
         </w:rPr>
         <w:t xml:space="preserve">no incluye</w:t>
       </w:r>
@@ -3670,6 +3986,7 @@
           <w:color w:val="1A1A1A"/>
           <w:sz w:val="22"/>
           <w:szCs w:val="22"/>
+          <w:lang w:val="es-AR"/>
         </w:rPr>
         <w:t xml:space="preserve">:</w:t>
       </w:r>
@@ -3690,6 +4007,7 @@
           <w:color w:val="1A1A1A"/>
           <w:sz w:val="22"/>
           <w:szCs w:val="22"/>
+          <w:lang w:val="es-AR"/>
         </w:rPr>
         <w:t xml:space="preserve">El rediseño del flujo de escalamiento del CRM (riesgo R06), que cuenta con plan de tratamiento propio en la Etapa 2.</w:t>
       </w:r>
@@ -3710,6 +4028,7 @@
           <w:color w:val="1A1A1A"/>
           <w:sz w:val="22"/>
           <w:szCs w:val="22"/>
+          <w:lang w:val="es-AR"/>
         </w:rPr>
         <w:t xml:space="preserve">El reemplazo o la migración del CRM, del SGOT o de la base de datos de clientes y órdenes de trabajo.</w:t>
       </w:r>
@@ -3730,6 +4049,7 @@
           <w:color w:val="1A1A1A"/>
           <w:sz w:val="22"/>
           <w:szCs w:val="22"/>
+          <w:lang w:val="es-AR"/>
         </w:rPr>
         <w:t xml:space="preserve">Obra civil, tendido troncal, ampliación de nodos (riesgo R11) y mantenimiento preventivo del cable (riesgo R08).</w:t>
       </w:r>
@@ -3750,6 +4070,7 @@
           <w:color w:val="1A1A1A"/>
           <w:sz w:val="22"/>
           <w:szCs w:val="22"/>
+          <w:lang w:val="es-AR"/>
         </w:rPr>
         <w:t xml:space="preserve">El reemplazo del firewall (riesgo R03), la redundancia del balanceador de carga (riesgo R09) y la correlación de eventos del NMS (riesgo R10).</w:t>
       </w:r>
@@ -3770,6 +4091,7 @@
           <w:color w:val="1A1A1A"/>
           <w:sz w:val="22"/>
           <w:szCs w:val="22"/>
+          <w:lang w:val="es-AR"/>
         </w:rPr>
         <w:t xml:space="preserve">Los procesos de venta, facturación y recupero de clientes.</w:t>
       </w:r>
@@ -3790,6 +4112,7 @@
           <w:color w:val="1A1A1A"/>
           <w:sz w:val="22"/>
           <w:szCs w:val="22"/>
+          <w:lang w:val="es-AR"/>
         </w:rPr>
         <w:t xml:space="preserve">Otros procesos de campo distintos de la instalación: reparaciones, mudanzas y desinstalaciones.</w:t>
       </w:r>
@@ -3810,6 +4133,7 @@
           <w:color w:val="1A1A1A"/>
           <w:sz w:val="22"/>
           <w:szCs w:val="22"/>
+          <w:lang w:val="es-AR"/>
         </w:rPr>
         <w:t xml:space="preserve">La adquisición de vehículos y fusionadoras de fibra óptica.</w:t>
       </w:r>
@@ -3830,20 +4154,21 @@
           <w:color w:val="1A1A1A"/>
           <w:sz w:val="22"/>
           <w:szCs w:val="22"/>
+          <w:lang w:val="es-AR"/>
         </w:rPr>
         <w:t xml:space="preserve">Las actividades 1 y 2 del proceso modelado en la Etapa 1 —recepción de la solicitud y verificación de cobertura—, que continúan gestionándose en el CRM.</w:t>
       </w:r>
     </w:p>
     <w:p>
       <w:pPr>
-        <w:spacing w:after="260" w:before="0"/>
+        <w:spacing w:after="160" w:before="0"/>
       </w:pPr>
     </w:p>
     <w:p>
       <w:pPr>
         <w:pStyle w:val="Heading2"/>
         <w:keepNext/>
-        <w:spacing w:after="140" w:before="400"/>
+        <w:spacing w:after="120" w:before="300"/>
       </w:pPr>
       <w:r>
         <w:rPr>
@@ -3854,36 +4179,41 @@
           <w:spacing w:val="18"/>
           <w:sz w:val="21"/>
           <w:szCs w:val="21"/>
+          <w:lang w:val="es-AR"/>
         </w:rPr>
         <w:t xml:space="preserve">FIRMA AUTORIZANTE</w:t>
       </w:r>
     </w:p>
     <w:p>
       <w:pPr>
-        <w:spacing w:after="140" w:line="288"/>
-        <w:jc w:val="both"/>
-      </w:pPr>
-      <w:r>
-        <w:rPr>
-          <w:rFonts w:ascii="Arial" w:cs="Arial" w:eastAsia="Arial" w:hAnsi="Arial"/>
-          <w:color w:val="1A1A1A"/>
-          <w:sz w:val="22"/>
-          <w:szCs w:val="22"/>
+        <w:keepNext/>
+        <w:spacing w:after="120" w:line="280"/>
+        <w:jc w:val="left"/>
+      </w:pPr>
+      <w:r>
+        <w:rPr>
+          <w:rFonts w:ascii="Arial" w:cs="Arial" w:eastAsia="Arial" w:hAnsi="Arial"/>
+          <w:color w:val="1A1A1A"/>
+          <w:sz w:val="22"/>
+          <w:szCs w:val="22"/>
+          <w:lang w:val="es-AR"/>
         </w:rPr>
         <w:t xml:space="preserve">Nombre: _______________________________________________</w:t>
       </w:r>
     </w:p>
     <w:p>
       <w:pPr>
-        <w:spacing w:after="140" w:line="288"/>
-        <w:jc w:val="both"/>
-      </w:pPr>
-      <w:r>
-        <w:rPr>
-          <w:rFonts w:ascii="Arial" w:cs="Arial" w:eastAsia="Arial" w:hAnsi="Arial"/>
-          <w:color w:val="1A1A1A"/>
-          <w:sz w:val="22"/>
-          <w:szCs w:val="22"/>
+        <w:keepNext/>
+        <w:spacing w:after="120" w:line="280"/>
+        <w:jc w:val="left"/>
+      </w:pPr>
+      <w:r>
+        <w:rPr>
+          <w:rFonts w:ascii="Arial" w:cs="Arial" w:eastAsia="Arial" w:hAnsi="Arial"/>
+          <w:color w:val="1A1A1A"/>
+          <w:sz w:val="22"/>
+          <w:szCs w:val="22"/>
+          <w:lang w:val="es-AR"/>
         </w:rPr>
         <w:t xml:space="preserve">Título: _______________________________________________</w:t>
       </w:r>
@@ -4116,6 +4446,12 @@
       <w:startOverride w:val="1"/>
     </w:lvlOverride>
   </w:num>
+  <w:num w:numId="3">
+    <w:abstractNumId w:val="2"/>
+    <w:lvlOverride w:ilvl="0">
+      <w:startOverride w:val="1"/>
+    </w:lvlOverride>
+  </w:num>
 </w:numbering>
 </file>
 
@@ -4128,6 +4464,7 @@
         <w:color w:val="1A1A1A"/>
         <w:sz w:val="22"/>
         <w:szCs w:val="22"/>
+        <w:lang w:val="es-AR"/>
       </w:rPr>
     </w:rPrDefault>
     <w:pPrDefault/>

</xml_diff>